<commit_message>
Update the role dashboard fact sheets and Word files for the new dashboards
Rewrites every sheet to match the dashboards as built (action queue, honest period rules,
notifications, enrolment and progress, quotas, recovery figures, self-registration and
document uploads) and removes the test login addresses from the public repo. Hides the
registry panel from contractors who have no registry record.

Co-Authored-By: Claude Opus 5.5 <noreply@anthropic.com>
</commit_message>
<xml_diff>
--- a/docs/role-dashboard-fact-sheets/word/ZimHVAC-00-Index.docx
+++ b/docs/role-dashboard-fact-sheets/word/ZimHVAC-00-Index.docx
@@ -15,7 +15,7 @@
         <w:spacing w:after="120"/>
       </w:pPr>
       <w:r>
-        <w:t xml:space="preserve">Source: the live ZimHVAC app code (</w:t>
+        <w:t xml:space="preserve">Describes the role dashboards of the Zimbabwe HVAC Compliance Registry (zimhvacregistry.org) as built in code version </w:t>
       </w:r>
       <w:r>
         <w:rPr>
@@ -23,10 +23,10 @@
           <w:sz w:val="20"/>
           <w:szCs w:val="20"/>
         </w:rPr>
-        <w:t xml:space="preserve">NickGwanzura/coolpro2026</w:t>
-      </w:r>
-      <w:r>
-        <w:t xml:space="preserve">, served at zimhvacregistry.org). Facts below come from the dashboard page, sidebar navigation and route-permission rules in that code. Nothing here was verified by logging in, so check screenshots against the live site before publishing.</w:t>
+        <w:t xml:space="preserve">b95cd16</w:t>
+      </w:r>
+      <w:r>
+        <w:t xml:space="preserve"> (10 October 2026). Written from the application code, not from a logged-in session, so check screenshots against the live site before publishing. Some items go live only when that version is deployed.</w:t>
       </w:r>
     </w:p>
     <w:p>
@@ -50,9 +50,9 @@
         </w:tblBorders>
       </w:tblPr>
       <w:tblGrid>
-        <w:gridCol w:w="3120"/>
-        <w:gridCol w:w="3120"/>
-        <w:gridCol w:w="3120"/>
+        <w:gridCol w:w="2808"/>
+        <w:gridCol w:w="3276"/>
+        <w:gridCol w:w="3276"/>
       </w:tblGrid>
       <w:tr>
         <w:trPr>
@@ -60,7 +60,7 @@
         </w:trPr>
         <w:tc>
           <w:tcPr>
-            <w:tcW w:type="dxa" w:w="3120"/>
+            <w:tcW w:type="dxa" w:w="2808"/>
             <w:tcBorders>
               <w:top w:val="single" w:color="D6D3D1" w:sz="4"/>
               <w:left w:val="single" w:color="D6D3D1" w:sz="4"/>
@@ -89,7 +89,7 @@
         </w:tc>
         <w:tc>
           <w:tcPr>
-            <w:tcW w:type="dxa" w:w="3120"/>
+            <w:tcW w:type="dxa" w:w="3276"/>
             <w:tcBorders>
               <w:top w:val="single" w:color="D6D3D1" w:sz="4"/>
               <w:left w:val="single" w:color="D6D3D1" w:sz="4"/>
@@ -118,7 +118,7 @@
         </w:tc>
         <w:tc>
           <w:tcPr>
-            <w:tcW w:type="dxa" w:w="3120"/>
+            <w:tcW w:type="dxa" w:w="3276"/>
             <w:tcBorders>
               <w:top w:val="single" w:color="D6D3D1" w:sz="4"/>
               <w:left w:val="single" w:color="D6D3D1" w:sz="4"/>
@@ -147,9 +147,12 @@
         </w:tc>
       </w:tr>
       <w:tr>
-        <w:tc>
-          <w:tcPr>
-            <w:tcW w:type="dxa" w:w="3120"/>
+        <w:trPr>
+          <w:cantSplit/>
+        </w:trPr>
+        <w:tc>
+          <w:tcPr>
+            <w:tcW w:type="dxa" w:w="2808"/>
             <w:tcBorders>
               <w:top w:val="single" w:color="D6D3D1" w:sz="4"/>
               <w:left w:val="single" w:color="D6D3D1" w:sz="4"/>
@@ -175,7 +178,7 @@
         </w:tc>
         <w:tc>
           <w:tcPr>
-            <w:tcW w:type="dxa" w:w="3120"/>
+            <w:tcW w:type="dxa" w:w="3276"/>
             <w:tcBorders>
               <w:top w:val="single" w:color="D6D3D1" w:sz="4"/>
               <w:left w:val="single" w:color="D6D3D1" w:sz="4"/>
@@ -201,35 +204,38 @@
         </w:tc>
         <w:tc>
           <w:tcPr>
-            <w:tcW w:type="dxa" w:w="3120"/>
-            <w:tcBorders>
-              <w:top w:val="single" w:color="D6D3D1" w:sz="4"/>
-              <w:left w:val="single" w:color="D6D3D1" w:sz="4"/>
-              <w:bottom w:val="single" w:color="D6D3D1" w:sz="4"/>
-              <w:right w:val="single" w:color="D6D3D1" w:sz="4"/>
-            </w:tcBorders>
-            <w:tcMar>
-              <w:top w:type="dxa" w:w="60"/>
-              <w:left w:type="dxa" w:w="100"/>
-              <w:bottom w:type="dxa" w:w="60"/>
-              <w:right w:type="dxa" w:w="100"/>
-            </w:tcMar>
-          </w:tcPr>
-          <w:p>
-            <w:r>
-              <w:rPr>
-                <w:sz w:val="20"/>
-                <w:szCs w:val="20"/>
-              </w:rPr>
-              <w:t xml:space="preserve">Jobs, certificates (COC), refrigerant logs</w:t>
+            <w:tcW w:type="dxa" w:w="3276"/>
+            <w:tcBorders>
+              <w:top w:val="single" w:color="D6D3D1" w:sz="4"/>
+              <w:left w:val="single" w:color="D6D3D1" w:sz="4"/>
+              <w:bottom w:val="single" w:color="D6D3D1" w:sz="4"/>
+              <w:right w:val="single" w:color="D6D3D1" w:sz="4"/>
+            </w:tcBorders>
+            <w:tcMar>
+              <w:top w:type="dxa" w:w="60"/>
+              <w:left w:type="dxa" w:w="100"/>
+              <w:bottom w:type="dxa" w:w="60"/>
+              <w:right w:type="dxa" w:w="100"/>
+            </w:tcMar>
+          </w:tcPr>
+          <w:p>
+            <w:r>
+              <w:rPr>
+                <w:sz w:val="20"/>
+                <w:szCs w:val="20"/>
+              </w:rPr>
+              <w:t xml:space="preserve">Jobs, certificates (COC), refrigerant logs, membership and renewal</w:t>
             </w:r>
           </w:p>
         </w:tc>
       </w:tr>
       <w:tr>
-        <w:tc>
-          <w:tcPr>
-            <w:tcW w:type="dxa" w:w="3120"/>
+        <w:trPr>
+          <w:cantSplit/>
+        </w:trPr>
+        <w:tc>
+          <w:tcPr>
+            <w:tcW w:type="dxa" w:w="2808"/>
             <w:tcBorders>
               <w:top w:val="single" w:color="D6D3D1" w:sz="4"/>
               <w:left w:val="single" w:color="D6D3D1" w:sz="4"/>
@@ -255,7 +261,7 @@
         </w:tc>
         <w:tc>
           <w:tcPr>
-            <w:tcW w:type="dxa" w:w="3120"/>
+            <w:tcW w:type="dxa" w:w="3276"/>
             <w:tcBorders>
               <w:top w:val="single" w:color="D6D3D1" w:sz="4"/>
               <w:left w:val="single" w:color="D6D3D1" w:sz="4"/>
@@ -281,35 +287,38 @@
         </w:tc>
         <w:tc>
           <w:tcPr>
-            <w:tcW w:type="dxa" w:w="3120"/>
-            <w:tcBorders>
-              <w:top w:val="single" w:color="D6D3D1" w:sz="4"/>
-              <w:left w:val="single" w:color="D6D3D1" w:sz="4"/>
-              <w:bottom w:val="single" w:color="D6D3D1" w:sz="4"/>
-              <w:right w:val="single" w:color="D6D3D1" w:sz="4"/>
-            </w:tcBorders>
-            <w:tcMar>
-              <w:top w:type="dxa" w:w="60"/>
-              <w:left w:type="dxa" w:w="100"/>
-              <w:bottom w:type="dxa" w:w="60"/>
-              <w:right w:type="dxa" w:w="100"/>
-            </w:tcMar>
-          </w:tcPr>
-          <w:p>
-            <w:r>
-              <w:rPr>
-                <w:sz w:val="20"/>
-                <w:szCs w:val="20"/>
-              </w:rPr>
-              <w:t xml:space="preserve">Courses, grading, training sessions</w:t>
+            <w:tcW w:type="dxa" w:w="3276"/>
+            <w:tcBorders>
+              <w:top w:val="single" w:color="D6D3D1" w:sz="4"/>
+              <w:left w:val="single" w:color="D6D3D1" w:sz="4"/>
+              <w:bottom w:val="single" w:color="D6D3D1" w:sz="4"/>
+              <w:right w:val="single" w:color="D6D3D1" w:sz="4"/>
+            </w:tcBorders>
+            <w:tcMar>
+              <w:top w:type="dxa" w:w="60"/>
+              <w:left w:type="dxa" w:w="100"/>
+              <w:bottom w:type="dxa" w:w="60"/>
+              <w:right w:type="dxa" w:w="100"/>
+            </w:tcMar>
+          </w:tcPr>
+          <w:p>
+            <w:r>
+              <w:rPr>
+                <w:sz w:val="20"/>
+                <w:szCs w:val="20"/>
+              </w:rPr>
+              <w:t xml:space="preserve">Courses, enrolments, grading, certificate requests</w:t>
             </w:r>
           </w:p>
         </w:tc>
       </w:tr>
       <w:tr>
-        <w:tc>
-          <w:tcPr>
-            <w:tcW w:type="dxa" w:w="3120"/>
+        <w:trPr>
+          <w:cantSplit/>
+        </w:trPr>
+        <w:tc>
+          <w:tcPr>
+            <w:tcW w:type="dxa" w:w="2808"/>
             <w:tcBorders>
               <w:top w:val="single" w:color="D6D3D1" w:sz="4"/>
               <w:left w:val="single" w:color="D6D3D1" w:sz="4"/>
@@ -335,7 +344,7 @@
         </w:tc>
         <w:tc>
           <w:tcPr>
-            <w:tcW w:type="dxa" w:w="3120"/>
+            <w:tcW w:type="dxa" w:w="3276"/>
             <w:tcBorders>
               <w:top w:val="single" w:color="D6D3D1" w:sz="4"/>
               <w:left w:val="single" w:color="D6D3D1" w:sz="4"/>
@@ -361,7 +370,7 @@
         </w:tc>
         <w:tc>
           <w:tcPr>
-            <w:tcW w:type="dxa" w:w="3120"/>
+            <w:tcW w:type="dxa" w:w="3276"/>
             <w:tcBorders>
               <w:top w:val="single" w:color="D6D3D1" w:sz="4"/>
               <w:left w:val="single" w:color="D6D3D1" w:sz="4"/>
@@ -387,9 +396,12 @@
         </w:tc>
       </w:tr>
       <w:tr>
-        <w:tc>
-          <w:tcPr>
-            <w:tcW w:type="dxa" w:w="3120"/>
+        <w:trPr>
+          <w:cantSplit/>
+        </w:trPr>
+        <w:tc>
+          <w:tcPr>
+            <w:tcW w:type="dxa" w:w="2808"/>
             <w:tcBorders>
               <w:top w:val="single" w:color="D6D3D1" w:sz="4"/>
               <w:left w:val="single" w:color="D6D3D1" w:sz="4"/>
@@ -415,7 +427,7 @@
         </w:tc>
         <w:tc>
           <w:tcPr>
-            <w:tcW w:type="dxa" w:w="3120"/>
+            <w:tcW w:type="dxa" w:w="3276"/>
             <w:tcBorders>
               <w:top w:val="single" w:color="D6D3D1" w:sz="4"/>
               <w:left w:val="single" w:color="D6D3D1" w:sz="4"/>
@@ -441,35 +453,38 @@
         </w:tc>
         <w:tc>
           <w:tcPr>
-            <w:tcW w:type="dxa" w:w="3120"/>
-            <w:tcBorders>
-              <w:top w:val="single" w:color="D6D3D1" w:sz="4"/>
-              <w:left w:val="single" w:color="D6D3D1" w:sz="4"/>
-              <w:bottom w:val="single" w:color="D6D3D1" w:sz="4"/>
-              <w:right w:val="single" w:color="D6D3D1" w:sz="4"/>
-            </w:tcBorders>
-            <w:tcMar>
-              <w:top w:type="dxa" w:w="60"/>
-              <w:left w:type="dxa" w:w="100"/>
-              <w:bottom w:type="dxa" w:w="60"/>
-              <w:right w:type="dxa" w:w="100"/>
-            </w:tcMar>
-          </w:tcPr>
-          <w:p>
-            <w:r>
-              <w:rPr>
-                <w:sz w:val="20"/>
-                <w:szCs w:val="20"/>
-              </w:rPr>
-              <w:t xml:space="preserve">Gas reorders, compliance certificates, ledger</w:t>
+            <w:tcW w:type="dxa" w:w="3276"/>
+            <w:tcBorders>
+              <w:top w:val="single" w:color="D6D3D1" w:sz="4"/>
+              <w:left w:val="single" w:color="D6D3D1" w:sz="4"/>
+              <w:bottom w:val="single" w:color="D6D3D1" w:sz="4"/>
+              <w:right w:val="single" w:color="D6D3D1" w:sz="4"/>
+            </w:tcBorders>
+            <w:tcMar>
+              <w:top w:type="dxa" w:w="60"/>
+              <w:left w:type="dxa" w:w="100"/>
+              <w:bottom w:type="dxa" w:w="60"/>
+              <w:right w:type="dxa" w:w="100"/>
+            </w:tcMar>
+          </w:tcPr>
+          <w:p>
+            <w:r>
+              <w:rPr>
+                <w:sz w:val="20"/>
+                <w:szCs w:val="20"/>
+              </w:rPr>
+              <w:t xml:space="preserve">Gas reorders, compliance certificates, ledger, buyer checks</w:t>
             </w:r>
           </w:p>
         </w:tc>
       </w:tr>
       <w:tr>
-        <w:tc>
-          <w:tcPr>
-            <w:tcW w:type="dxa" w:w="3120"/>
+        <w:trPr>
+          <w:cantSplit/>
+        </w:trPr>
+        <w:tc>
+          <w:tcPr>
+            <w:tcW w:type="dxa" w:w="2808"/>
             <w:tcBorders>
               <w:top w:val="single" w:color="D6D3D1" w:sz="4"/>
               <w:left w:val="single" w:color="D6D3D1" w:sz="4"/>
@@ -495,7 +510,7 @@
         </w:tc>
         <w:tc>
           <w:tcPr>
-            <w:tcW w:type="dxa" w:w="3120"/>
+            <w:tcW w:type="dxa" w:w="3276"/>
             <w:tcBorders>
               <w:top w:val="single" w:color="D6D3D1" w:sz="4"/>
               <w:left w:val="single" w:color="D6D3D1" w:sz="4"/>
@@ -521,35 +536,38 @@
         </w:tc>
         <w:tc>
           <w:tcPr>
-            <w:tcW w:type="dxa" w:w="3120"/>
-            <w:tcBorders>
-              <w:top w:val="single" w:color="D6D3D1" w:sz="4"/>
-              <w:left w:val="single" w:color="D6D3D1" w:sz="4"/>
-              <w:bottom w:val="single" w:color="D6D3D1" w:sz="4"/>
-              <w:right w:val="single" w:color="D6D3D1" w:sz="4"/>
-            </w:tcBorders>
-            <w:tcMar>
-              <w:top w:type="dxa" w:w="60"/>
-              <w:left w:type="dxa" w:w="100"/>
-              <w:bottom w:type="dxa" w:w="60"/>
-              <w:right w:type="dxa" w:w="100"/>
-            </w:tcMar>
-          </w:tcPr>
-          <w:p>
-            <w:r>
-              <w:rPr>
-                <w:sz w:val="20"/>
-                <w:szCs w:val="20"/>
-              </w:rPr>
-              <w:t xml:space="preserve">Registry, approvals, NOU oversight, reporting</w:t>
+            <w:tcW w:type="dxa" w:w="3276"/>
+            <w:tcBorders>
+              <w:top w:val="single" w:color="D6D3D1" w:sz="4"/>
+              <w:left w:val="single" w:color="D6D3D1" w:sz="4"/>
+              <w:bottom w:val="single" w:color="D6D3D1" w:sz="4"/>
+              <w:right w:val="single" w:color="D6D3D1" w:sz="4"/>
+            </w:tcBorders>
+            <w:tcMar>
+              <w:top w:type="dxa" w:w="60"/>
+              <w:left w:type="dxa" w:w="100"/>
+              <w:bottom w:type="dxa" w:w="60"/>
+              <w:right w:type="dxa" w:w="100"/>
+            </w:tcMar>
+          </w:tcPr>
+          <w:p>
+            <w:r>
+              <w:rPr>
+                <w:sz w:val="20"/>
+                <w:szCs w:val="20"/>
+              </w:rPr>
+              <w:t xml:space="preserve">Action queue, registry, approvals, NOU oversight, reporting</w:t>
             </w:r>
           </w:p>
         </w:tc>
       </w:tr>
       <w:tr>
-        <w:tc>
-          <w:tcPr>
-            <w:tcW w:type="dxa" w:w="3120"/>
+        <w:trPr>
+          <w:cantSplit/>
+        </w:trPr>
+        <w:tc>
+          <w:tcPr>
+            <w:tcW w:type="dxa" w:w="2808"/>
             <w:tcBorders>
               <w:top w:val="single" w:color="D6D3D1" w:sz="4"/>
               <w:left w:val="single" w:color="D6D3D1" w:sz="4"/>
@@ -575,7 +593,7 @@
         </w:tc>
         <w:tc>
           <w:tcPr>
-            <w:tcW w:type="dxa" w:w="3120"/>
+            <w:tcW w:type="dxa" w:w="3276"/>
             <w:tcBorders>
               <w:top w:val="single" w:color="D6D3D1" w:sz="4"/>
               <w:left w:val="single" w:color="D6D3D1" w:sz="4"/>
@@ -601,35 +619,38 @@
         </w:tc>
         <w:tc>
           <w:tcPr>
-            <w:tcW w:type="dxa" w:w="3120"/>
-            <w:tcBorders>
-              <w:top w:val="single" w:color="D6D3D1" w:sz="4"/>
-              <w:left w:val="single" w:color="D6D3D1" w:sz="4"/>
-              <w:bottom w:val="single" w:color="D6D3D1" w:sz="4"/>
-              <w:right w:val="single" w:color="D6D3D1" w:sz="4"/>
-            </w:tcBorders>
-            <w:tcMar>
-              <w:top w:type="dxa" w:w="60"/>
-              <w:left w:type="dxa" w:w="100"/>
-              <w:bottom w:type="dxa" w:w="60"/>
-              <w:right w:type="dxa" w:w="100"/>
-            </w:tcMar>
-          </w:tcPr>
-          <w:p>
-            <w:r>
-              <w:rPr>
-                <w:sz w:val="20"/>
-                <w:szCs w:val="20"/>
-              </w:rPr>
-              <w:t xml:space="preserve">Courses, assessments, certificates</w:t>
+            <w:tcW w:type="dxa" w:w="3276"/>
+            <w:tcBorders>
+              <w:top w:val="single" w:color="D6D3D1" w:sz="4"/>
+              <w:left w:val="single" w:color="D6D3D1" w:sz="4"/>
+              <w:bottom w:val="single" w:color="D6D3D1" w:sz="4"/>
+              <w:right w:val="single" w:color="D6D3D1" w:sz="4"/>
+            </w:tcBorders>
+            <w:tcMar>
+              <w:top w:type="dxa" w:w="60"/>
+              <w:left w:type="dxa" w:w="100"/>
+              <w:bottom w:type="dxa" w:w="60"/>
+              <w:right w:type="dxa" w:w="100"/>
+            </w:tcMar>
+          </w:tcPr>
+          <w:p>
+            <w:r>
+              <w:rPr>
+                <w:sz w:val="20"/>
+                <w:szCs w:val="20"/>
+              </w:rPr>
+              <w:t xml:space="preserve">Enrolled courses, progress, exam results</w:t>
             </w:r>
           </w:p>
         </w:tc>
       </w:tr>
       <w:tr>
-        <w:tc>
-          <w:tcPr>
-            <w:tcW w:type="dxa" w:w="3120"/>
+        <w:trPr>
+          <w:cantSplit/>
+        </w:trPr>
+        <w:tc>
+          <w:tcPr>
+            <w:tcW w:type="dxa" w:w="2808"/>
             <w:tcBorders>
               <w:top w:val="single" w:color="D6D3D1" w:sz="4"/>
               <w:left w:val="single" w:color="D6D3D1" w:sz="4"/>
@@ -655,7 +676,7 @@
         </w:tc>
         <w:tc>
           <w:tcPr>
-            <w:tcW w:type="dxa" w:w="3120"/>
+            <w:tcW w:type="dxa" w:w="3276"/>
             <w:tcBorders>
               <w:top w:val="single" w:color="D6D3D1" w:sz="4"/>
               <w:left w:val="single" w:color="D6D3D1" w:sz="4"/>
@@ -681,27 +702,27 @@
         </w:tc>
         <w:tc>
           <w:tcPr>
-            <w:tcW w:type="dxa" w:w="3120"/>
-            <w:tcBorders>
-              <w:top w:val="single" w:color="D6D3D1" w:sz="4"/>
-              <w:left w:val="single" w:color="D6D3D1" w:sz="4"/>
-              <w:bottom w:val="single" w:color="D6D3D1" w:sz="4"/>
-              <w:right w:val="single" w:color="D6D3D1" w:sz="4"/>
-            </w:tcBorders>
-            <w:tcMar>
-              <w:top w:type="dxa" w:w="60"/>
-              <w:left w:type="dxa" w:w="100"/>
-              <w:bottom w:type="dxa" w:w="60"/>
-              <w:right w:type="dxa" w:w="100"/>
-            </w:tcMar>
-          </w:tcPr>
-          <w:p>
-            <w:r>
-              <w:rPr>
-                <w:sz w:val="20"/>
-                <w:szCs w:val="20"/>
-              </w:rPr>
-              <w:t xml:space="preserve">Same tools as Technician (pending deploy) plus onboarding</w:t>
+            <w:tcW w:type="dxa" w:w="3276"/>
+            <w:tcBorders>
+              <w:top w:val="single" w:color="D6D3D1" w:sz="4"/>
+              <w:left w:val="single" w:color="D6D3D1" w:sz="4"/>
+              <w:bottom w:val="single" w:color="D6D3D1" w:sz="4"/>
+              <w:right w:val="single" w:color="D6D3D1" w:sz="4"/>
+            </w:tcBorders>
+            <w:tcMar>
+              <w:top w:type="dxa" w:w="60"/>
+              <w:left w:type="dxa" w:w="100"/>
+              <w:bottom w:type="dxa" w:w="60"/>
+              <w:right w:type="dxa" w:w="100"/>
+            </w:tcMar>
+          </w:tcPr>
+          <w:p>
+            <w:r>
+              <w:rPr>
+                <w:sz w:val="20"/>
+                <w:szCs w:val="20"/>
+              </w:rPr>
+              <w:t xml:space="preserve">Same field tools as Technician, plus onboarding</w:t>
             </w:r>
           </w:p>
         </w:tc>
@@ -740,7 +761,7 @@
         <w:t xml:space="preserve">/dashboard</w:t>
       </w:r>
       <w:r>
-        <w:t xml:space="preserve"> after login. The page is titled </w:t>
+        <w:t xml:space="preserve"> after login. It is titled </w:t>
       </w:r>
       <w:r>
         <w:rPr>
@@ -772,7 +793,7 @@
         </w:numPr>
       </w:pPr>
       <w:r>
-        <w:t xml:space="preserve">The header greets the user by name ("Welcome back, &lt;name&gt;") and has a date filter (Today / Week / Month). Organization Admin also gets a province filter.</w:t>
+        <w:t xml:space="preserve">Each role sees a row of KPI cards, then Quick Actions, then role-specific panels. Every card has a "How this is counted" note.</w:t>
       </w:r>
     </w:p>
     <w:p>
@@ -784,7 +805,14 @@
         </w:numPr>
       </w:pPr>
       <w:r>
-        <w:t xml:space="preserve">Each role sees a row of KPI cards, then a row of four Quick Action tiles, then role-specific panels.</w:t>
+        <w:rPr>
+          <w:b/>
+          <w:bCs/>
+        </w:rPr>
+        <w:t xml:space="preserve">The Today / This Week / This Month filter</w:t>
+      </w:r>
+      <w:r>
+        <w:t xml:space="preserve"> (last 24 hours, 7 days, 30 days) changes only the cards that measure activity, such as jobs completed or volume ordered. Cards that show a current state, such as pending approvals, ignore it, and say so in their note.</w:t>
       </w:r>
     </w:p>
     <w:p>
@@ -796,7 +824,14 @@
         </w:numPr>
       </w:pPr>
       <w:r>
-        <w:t xml:space="preserve">Each KPI card has a "How this is counted" note explaining its calculation.</w:t>
+        <w:rPr>
+          <w:b/>
+          <w:bCs/>
+        </w:rPr>
+        <w:t xml:space="preserve">Loading and errors.</w:t>
+      </w:r>
+      <w:r>
+        <w:t xml:space="preserve"> While data loads a card shows an ellipsis. If it fails to load, the card shows a dash and a red banner names what could not be loaded. A failed load is never shown as zero.</w:t>
       </w:r>
     </w:p>
     <w:p>
@@ -808,7 +843,14 @@
         </w:numPr>
       </w:pPr>
       <w:r>
-        <w:t xml:space="preserve">Menu items and pages are limited by role. A role that opens a page it isn't allowed to see is blocked by the app.</w:t>
+        <w:rPr>
+          <w:b/>
+          <w:bCs/>
+        </w:rPr>
+        <w:t xml:space="preserve">Notifications.</w:t>
+      </w:r>
+      <w:r>
+        <w:t xml:space="preserve"> The bell in the top bar shows a live unread count. People are notified in the app when a COC, course, exam, certificate request or reorder is decided, and when their application is approved. Admins also get the application alerts described in the Organization Admin sheet.</w:t>
       </w:r>
     </w:p>
     <w:p>
@@ -820,18 +862,7 @@
         </w:numPr>
       </w:pPr>
       <w:r>
-        <w:t xml:space="preserve">Organization Admin has a longer, separate menu and a second dashboard at </w:t>
-      </w:r>
-      <w:r>
-        <w:rPr>
-          <w:rFonts w:ascii="Consolas" w:cs="Consolas" w:eastAsia="Consolas" w:hAnsi="Consolas"/>
-          <w:sz w:val="20"/>
-          <w:szCs w:val="20"/>
-        </w:rPr>
-        <w:t xml:space="preserve">/admin</w:t>
-      </w:r>
-      <w:r>
-        <w:t xml:space="preserve"> (Compliance Dashboard).</w:t>
+        <w:t xml:space="preserve">Menu items and pages are limited by role. A role that opens a page it is not allowed to see is blocked.</w:t>
       </w:r>
     </w:p>
     <w:p>
@@ -877,6 +908,53 @@
       </w:r>
       <w:r>
         <w:t xml:space="preserve">).</w:t>
+      </w:r>
+    </w:p>
+    <w:p>
+      <w:pPr>
+        <w:pStyle w:val="Heading2"/>
+      </w:pPr>
+      <w:r>
+        <w:t xml:space="preserve">How people get an account</w:t>
+      </w:r>
+    </w:p>
+    <w:p>
+      <w:pPr>
+        <w:spacing w:after="120"/>
+      </w:pPr>
+      <w:r>
+        <w:t xml:space="preserve">Technicians, students, suppliers, trainers, lecturers and contractors register themselves from the </w:t>
+      </w:r>
+      <w:r>
+        <w:rPr>
+          <w:b/>
+          <w:bCs/>
+        </w:rPr>
+        <w:t xml:space="preserve">Join</w:t>
+      </w:r>
+      <w:r>
+        <w:t xml:space="preserve"> page (</w:t>
+      </w:r>
+      <w:r>
+        <w:rPr>
+          <w:rFonts w:ascii="Consolas" w:cs="Consolas" w:eastAsia="Consolas" w:hAnsi="Consolas"/>
+          <w:sz w:val="20"/>
+          <w:szCs w:val="20"/>
+        </w:rPr>
+        <w:t xml:space="preserve">/join</w:t>
+      </w:r>
+      <w:r>
+        <w:t xml:space="preserve">). Each applicant confirms their email address first, can then upload supporting documents (ID, certificates, licences), and waits for an administrator to approve. They are emailed the decision, and if approved they log in with the password they chose. </w:t>
+      </w:r>
+      <w:r>
+        <w:rPr>
+          <w:b/>
+          <w:bCs/>
+        </w:rPr>
+        <w:t xml:space="preserve">Organization Admin accounts cannot be self-registered</w:t>
+      </w:r>
+      <w:r>
+        <w:t xml:space="preserve">; an existing administrator invites them from the Invites page.</w:t>
       </w:r>
     </w:p>
     <w:p>
@@ -900,13 +978,13 @@
         </w:tblBorders>
       </w:tblPr>
       <w:tblGrid>
-        <w:gridCol w:w="1337"/>
-        <w:gridCol w:w="1337"/>
-        <w:gridCol w:w="1337"/>
-        <w:gridCol w:w="1337"/>
-        <w:gridCol w:w="1337"/>
-        <w:gridCol w:w="1337"/>
-        <w:gridCol w:w="1338"/>
+        <w:gridCol w:w="2059"/>
+        <w:gridCol w:w="1216"/>
+        <w:gridCol w:w="1216"/>
+        <w:gridCol w:w="1216"/>
+        <w:gridCol w:w="1216"/>
+        <w:gridCol w:w="1216"/>
+        <w:gridCol w:w="1221"/>
       </w:tblGrid>
       <w:tr>
         <w:trPr>
@@ -914,7 +992,7 @@
         </w:trPr>
         <w:tc>
           <w:tcPr>
-            <w:tcW w:type="dxa" w:w="1337"/>
+            <w:tcW w:type="dxa" w:w="2059"/>
             <w:tcBorders>
               <w:top w:val="single" w:color="D6D3D1" w:sz="4"/>
               <w:left w:val="single" w:color="D6D3D1" w:sz="4"/>
@@ -943,7 +1021,7 @@
         </w:tc>
         <w:tc>
           <w:tcPr>
-            <w:tcW w:type="dxa" w:w="1337"/>
+            <w:tcW w:type="dxa" w:w="1216"/>
             <w:tcBorders>
               <w:top w:val="single" w:color="D6D3D1" w:sz="4"/>
               <w:left w:val="single" w:color="D6D3D1" w:sz="4"/>
@@ -972,7 +1050,7 @@
         </w:tc>
         <w:tc>
           <w:tcPr>
-            <w:tcW w:type="dxa" w:w="1337"/>
+            <w:tcW w:type="dxa" w:w="1216"/>
             <w:tcBorders>
               <w:top w:val="single" w:color="D6D3D1" w:sz="4"/>
               <w:left w:val="single" w:color="D6D3D1" w:sz="4"/>
@@ -1001,7 +1079,7 @@
         </w:tc>
         <w:tc>
           <w:tcPr>
-            <w:tcW w:type="dxa" w:w="1337"/>
+            <w:tcW w:type="dxa" w:w="1216"/>
             <w:tcBorders>
               <w:top w:val="single" w:color="D6D3D1" w:sz="4"/>
               <w:left w:val="single" w:color="D6D3D1" w:sz="4"/>
@@ -1030,7 +1108,7 @@
         </w:tc>
         <w:tc>
           <w:tcPr>
-            <w:tcW w:type="dxa" w:w="1337"/>
+            <w:tcW w:type="dxa" w:w="1216"/>
             <w:tcBorders>
               <w:top w:val="single" w:color="D6D3D1" w:sz="4"/>
               <w:left w:val="single" w:color="D6D3D1" w:sz="4"/>
@@ -1059,7 +1137,7 @@
         </w:tc>
         <w:tc>
           <w:tcPr>
-            <w:tcW w:type="dxa" w:w="1337"/>
+            <w:tcW w:type="dxa" w:w="1216"/>
             <w:tcBorders>
               <w:top w:val="single" w:color="D6D3D1" w:sz="4"/>
               <w:left w:val="single" w:color="D6D3D1" w:sz="4"/>
@@ -1088,7 +1166,7 @@
         </w:tc>
         <w:tc>
           <w:tcPr>
-            <w:tcW w:type="dxa" w:w="1338"/>
+            <w:tcW w:type="dxa" w:w="1221"/>
             <w:tcBorders>
               <w:top w:val="single" w:color="D6D3D1" w:sz="4"/>
               <w:left w:val="single" w:color="D6D3D1" w:sz="4"/>
@@ -1117,9 +1195,12 @@
         </w:tc>
       </w:tr>
       <w:tr>
-        <w:tc>
-          <w:tcPr>
-            <w:tcW w:type="dxa" w:w="1337"/>
+        <w:trPr>
+          <w:cantSplit/>
+        </w:trPr>
+        <w:tc>
+          <w:tcPr>
+            <w:tcW w:type="dxa" w:w="2059"/>
             <w:tcBorders>
               <w:top w:val="single" w:color="D6D3D1" w:sz="4"/>
               <w:left w:val="single" w:color="D6D3D1" w:sz="4"/>
@@ -1145,137 +1226,137 @@
         </w:tc>
         <w:tc>
           <w:tcPr>
-            <w:tcW w:type="dxa" w:w="1337"/>
-            <w:tcBorders>
-              <w:top w:val="single" w:color="D6D3D1" w:sz="4"/>
-              <w:left w:val="single" w:color="D6D3D1" w:sz="4"/>
-              <w:bottom w:val="single" w:color="D6D3D1" w:sz="4"/>
-              <w:right w:val="single" w:color="D6D3D1" w:sz="4"/>
-            </w:tcBorders>
-            <w:tcMar>
-              <w:top w:type="dxa" w:w="60"/>
-              <w:left w:type="dxa" w:w="100"/>
-              <w:bottom w:type="dxa" w:w="60"/>
-              <w:right w:type="dxa" w:w="100"/>
-            </w:tcMar>
-          </w:tcPr>
-          <w:p>
-            <w:r>
-              <w:rPr>
-                <w:sz w:val="20"/>
-                <w:szCs w:val="20"/>
-              </w:rPr>
-              <w:t xml:space="preserve">Yes</w:t>
-            </w:r>
-          </w:p>
-        </w:tc>
-        <w:tc>
-          <w:tcPr>
-            <w:tcW w:type="dxa" w:w="1337"/>
-            <w:tcBorders>
-              <w:top w:val="single" w:color="D6D3D1" w:sz="4"/>
-              <w:left w:val="single" w:color="D6D3D1" w:sz="4"/>
-              <w:bottom w:val="single" w:color="D6D3D1" w:sz="4"/>
-              <w:right w:val="single" w:color="D6D3D1" w:sz="4"/>
-            </w:tcBorders>
-            <w:tcMar>
-              <w:top w:type="dxa" w:w="60"/>
-              <w:left w:type="dxa" w:w="100"/>
-              <w:bottom w:type="dxa" w:w="60"/>
-              <w:right w:type="dxa" w:w="100"/>
-            </w:tcMar>
-          </w:tcPr>
-          <w:p>
-            <w:r>
-              <w:rPr>
-                <w:sz w:val="20"/>
-                <w:szCs w:val="20"/>
-              </w:rPr>
-              <w:t xml:space="preserve">Yes</w:t>
-            </w:r>
-          </w:p>
-        </w:tc>
-        <w:tc>
-          <w:tcPr>
-            <w:tcW w:type="dxa" w:w="1337"/>
-            <w:tcBorders>
-              <w:top w:val="single" w:color="D6D3D1" w:sz="4"/>
-              <w:left w:val="single" w:color="D6D3D1" w:sz="4"/>
-              <w:bottom w:val="single" w:color="D6D3D1" w:sz="4"/>
-              <w:right w:val="single" w:color="D6D3D1" w:sz="4"/>
-            </w:tcBorders>
-            <w:tcMar>
-              <w:top w:type="dxa" w:w="60"/>
-              <w:left w:type="dxa" w:w="100"/>
-              <w:bottom w:type="dxa" w:w="60"/>
-              <w:right w:type="dxa" w:w="100"/>
-            </w:tcMar>
-          </w:tcPr>
-          <w:p>
-            <w:r>
-              <w:rPr>
-                <w:sz w:val="20"/>
-                <w:szCs w:val="20"/>
-              </w:rPr>
-              <w:t xml:space="preserve">Yes</w:t>
-            </w:r>
-          </w:p>
-        </w:tc>
-        <w:tc>
-          <w:tcPr>
-            <w:tcW w:type="dxa" w:w="1337"/>
-            <w:tcBorders>
-              <w:top w:val="single" w:color="D6D3D1" w:sz="4"/>
-              <w:left w:val="single" w:color="D6D3D1" w:sz="4"/>
-              <w:bottom w:val="single" w:color="D6D3D1" w:sz="4"/>
-              <w:right w:val="single" w:color="D6D3D1" w:sz="4"/>
-            </w:tcBorders>
-            <w:tcMar>
-              <w:top w:type="dxa" w:w="60"/>
-              <w:left w:type="dxa" w:w="100"/>
-              <w:bottom w:type="dxa" w:w="60"/>
-              <w:right w:type="dxa" w:w="100"/>
-            </w:tcMar>
-          </w:tcPr>
-          <w:p>
-            <w:r>
-              <w:rPr>
-                <w:sz w:val="20"/>
-                <w:szCs w:val="20"/>
-              </w:rPr>
-              <w:t xml:space="preserve">Yes</w:t>
-            </w:r>
-          </w:p>
-        </w:tc>
-        <w:tc>
-          <w:tcPr>
-            <w:tcW w:type="dxa" w:w="1337"/>
-            <w:tcBorders>
-              <w:top w:val="single" w:color="D6D3D1" w:sz="4"/>
-              <w:left w:val="single" w:color="D6D3D1" w:sz="4"/>
-              <w:bottom w:val="single" w:color="D6D3D1" w:sz="4"/>
-              <w:right w:val="single" w:color="D6D3D1" w:sz="4"/>
-            </w:tcBorders>
-            <w:tcMar>
-              <w:top w:type="dxa" w:w="60"/>
-              <w:left w:type="dxa" w:w="100"/>
-              <w:bottom w:type="dxa" w:w="60"/>
-              <w:right w:type="dxa" w:w="100"/>
-            </w:tcMar>
-          </w:tcPr>
-          <w:p>
-            <w:r>
-              <w:rPr>
-                <w:sz w:val="20"/>
-                <w:szCs w:val="20"/>
-              </w:rPr>
-              <w:t xml:space="preserve">Yes</w:t>
-            </w:r>
-          </w:p>
-        </w:tc>
-        <w:tc>
-          <w:tcPr>
-            <w:tcW w:type="dxa" w:w="1338"/>
+            <w:tcW w:type="dxa" w:w="1216"/>
+            <w:tcBorders>
+              <w:top w:val="single" w:color="D6D3D1" w:sz="4"/>
+              <w:left w:val="single" w:color="D6D3D1" w:sz="4"/>
+              <w:bottom w:val="single" w:color="D6D3D1" w:sz="4"/>
+              <w:right w:val="single" w:color="D6D3D1" w:sz="4"/>
+            </w:tcBorders>
+            <w:tcMar>
+              <w:top w:type="dxa" w:w="60"/>
+              <w:left w:type="dxa" w:w="100"/>
+              <w:bottom w:type="dxa" w:w="60"/>
+              <w:right w:type="dxa" w:w="100"/>
+            </w:tcMar>
+          </w:tcPr>
+          <w:p>
+            <w:r>
+              <w:rPr>
+                <w:sz w:val="20"/>
+                <w:szCs w:val="20"/>
+              </w:rPr>
+              <w:t xml:space="preserve">Yes</w:t>
+            </w:r>
+          </w:p>
+        </w:tc>
+        <w:tc>
+          <w:tcPr>
+            <w:tcW w:type="dxa" w:w="1216"/>
+            <w:tcBorders>
+              <w:top w:val="single" w:color="D6D3D1" w:sz="4"/>
+              <w:left w:val="single" w:color="D6D3D1" w:sz="4"/>
+              <w:bottom w:val="single" w:color="D6D3D1" w:sz="4"/>
+              <w:right w:val="single" w:color="D6D3D1" w:sz="4"/>
+            </w:tcBorders>
+            <w:tcMar>
+              <w:top w:type="dxa" w:w="60"/>
+              <w:left w:type="dxa" w:w="100"/>
+              <w:bottom w:type="dxa" w:w="60"/>
+              <w:right w:type="dxa" w:w="100"/>
+            </w:tcMar>
+          </w:tcPr>
+          <w:p>
+            <w:r>
+              <w:rPr>
+                <w:sz w:val="20"/>
+                <w:szCs w:val="20"/>
+              </w:rPr>
+              <w:t xml:space="preserve">Yes</w:t>
+            </w:r>
+          </w:p>
+        </w:tc>
+        <w:tc>
+          <w:tcPr>
+            <w:tcW w:type="dxa" w:w="1216"/>
+            <w:tcBorders>
+              <w:top w:val="single" w:color="D6D3D1" w:sz="4"/>
+              <w:left w:val="single" w:color="D6D3D1" w:sz="4"/>
+              <w:bottom w:val="single" w:color="D6D3D1" w:sz="4"/>
+              <w:right w:val="single" w:color="D6D3D1" w:sz="4"/>
+            </w:tcBorders>
+            <w:tcMar>
+              <w:top w:type="dxa" w:w="60"/>
+              <w:left w:type="dxa" w:w="100"/>
+              <w:bottom w:type="dxa" w:w="60"/>
+              <w:right w:type="dxa" w:w="100"/>
+            </w:tcMar>
+          </w:tcPr>
+          <w:p>
+            <w:r>
+              <w:rPr>
+                <w:sz w:val="20"/>
+                <w:szCs w:val="20"/>
+              </w:rPr>
+              <w:t xml:space="preserve">Yes</w:t>
+            </w:r>
+          </w:p>
+        </w:tc>
+        <w:tc>
+          <w:tcPr>
+            <w:tcW w:type="dxa" w:w="1216"/>
+            <w:tcBorders>
+              <w:top w:val="single" w:color="D6D3D1" w:sz="4"/>
+              <w:left w:val="single" w:color="D6D3D1" w:sz="4"/>
+              <w:bottom w:val="single" w:color="D6D3D1" w:sz="4"/>
+              <w:right w:val="single" w:color="D6D3D1" w:sz="4"/>
+            </w:tcBorders>
+            <w:tcMar>
+              <w:top w:type="dxa" w:w="60"/>
+              <w:left w:type="dxa" w:w="100"/>
+              <w:bottom w:type="dxa" w:w="60"/>
+              <w:right w:type="dxa" w:w="100"/>
+            </w:tcMar>
+          </w:tcPr>
+          <w:p>
+            <w:r>
+              <w:rPr>
+                <w:sz w:val="20"/>
+                <w:szCs w:val="20"/>
+              </w:rPr>
+              <w:t xml:space="preserve">Yes</w:t>
+            </w:r>
+          </w:p>
+        </w:tc>
+        <w:tc>
+          <w:tcPr>
+            <w:tcW w:type="dxa" w:w="1216"/>
+            <w:tcBorders>
+              <w:top w:val="single" w:color="D6D3D1" w:sz="4"/>
+              <w:left w:val="single" w:color="D6D3D1" w:sz="4"/>
+              <w:bottom w:val="single" w:color="D6D3D1" w:sz="4"/>
+              <w:right w:val="single" w:color="D6D3D1" w:sz="4"/>
+            </w:tcBorders>
+            <w:tcMar>
+              <w:top w:type="dxa" w:w="60"/>
+              <w:left w:type="dxa" w:w="100"/>
+              <w:bottom w:type="dxa" w:w="60"/>
+              <w:right w:type="dxa" w:w="100"/>
+            </w:tcMar>
+          </w:tcPr>
+          <w:p>
+            <w:r>
+              <w:rPr>
+                <w:sz w:val="20"/>
+                <w:szCs w:val="20"/>
+              </w:rPr>
+              <w:t xml:space="preserve">Yes</w:t>
+            </w:r>
+          </w:p>
+        </w:tc>
+        <w:tc>
+          <w:tcPr>
+            <w:tcW w:type="dxa" w:w="1221"/>
             <w:tcBorders>
               <w:top w:val="single" w:color="D6D3D1" w:sz="4"/>
               <w:left w:val="single" w:color="D6D3D1" w:sz="4"/>
@@ -1301,9 +1382,12 @@
         </w:tc>
       </w:tr>
       <w:tr>
-        <w:tc>
-          <w:tcPr>
-            <w:tcW w:type="dxa" w:w="1337"/>
+        <w:trPr>
+          <w:cantSplit/>
+        </w:trPr>
+        <w:tc>
+          <w:tcPr>
+            <w:tcW w:type="dxa" w:w="2059"/>
             <w:tcBorders>
               <w:top w:val="single" w:color="D6D3D1" w:sz="4"/>
               <w:left w:val="single" w:color="D6D3D1" w:sz="4"/>
@@ -1329,59 +1413,59 @@
         </w:tc>
         <w:tc>
           <w:tcPr>
-            <w:tcW w:type="dxa" w:w="1337"/>
-            <w:tcBorders>
-              <w:top w:val="single" w:color="D6D3D1" w:sz="4"/>
-              <w:left w:val="single" w:color="D6D3D1" w:sz="4"/>
-              <w:bottom w:val="single" w:color="D6D3D1" w:sz="4"/>
-              <w:right w:val="single" w:color="D6D3D1" w:sz="4"/>
-            </w:tcBorders>
-            <w:tcMar>
-              <w:top w:type="dxa" w:w="60"/>
-              <w:left w:type="dxa" w:w="100"/>
-              <w:bottom w:type="dxa" w:w="60"/>
-              <w:right w:type="dxa" w:w="100"/>
-            </w:tcMar>
-          </w:tcPr>
-          <w:p>
-            <w:r>
-              <w:rPr>
-                <w:sz w:val="20"/>
-                <w:szCs w:val="20"/>
-              </w:rPr>
-              <w:t xml:space="preserve">Yes</w:t>
-            </w:r>
-          </w:p>
-        </w:tc>
-        <w:tc>
-          <w:tcPr>
-            <w:tcW w:type="dxa" w:w="1337"/>
-            <w:tcBorders>
-              <w:top w:val="single" w:color="D6D3D1" w:sz="4"/>
-              <w:left w:val="single" w:color="D6D3D1" w:sz="4"/>
-              <w:bottom w:val="single" w:color="D6D3D1" w:sz="4"/>
-              <w:right w:val="single" w:color="D6D3D1" w:sz="4"/>
-            </w:tcBorders>
-            <w:tcMar>
-              <w:top w:type="dxa" w:w="60"/>
-              <w:left w:type="dxa" w:w="100"/>
-              <w:bottom w:type="dxa" w:w="60"/>
-              <w:right w:type="dxa" w:w="100"/>
-            </w:tcMar>
-          </w:tcPr>
-          <w:p>
-            <w:r>
-              <w:rPr>
-                <w:sz w:val="20"/>
-                <w:szCs w:val="20"/>
-              </w:rPr>
-              <w:t xml:space="preserve">Yes</w:t>
-            </w:r>
-          </w:p>
-        </w:tc>
-        <w:tc>
-          <w:tcPr>
-            <w:tcW w:type="dxa" w:w="1337"/>
+            <w:tcW w:type="dxa" w:w="1216"/>
+            <w:tcBorders>
+              <w:top w:val="single" w:color="D6D3D1" w:sz="4"/>
+              <w:left w:val="single" w:color="D6D3D1" w:sz="4"/>
+              <w:bottom w:val="single" w:color="D6D3D1" w:sz="4"/>
+              <w:right w:val="single" w:color="D6D3D1" w:sz="4"/>
+            </w:tcBorders>
+            <w:tcMar>
+              <w:top w:type="dxa" w:w="60"/>
+              <w:left w:type="dxa" w:w="100"/>
+              <w:bottom w:type="dxa" w:w="60"/>
+              <w:right w:type="dxa" w:w="100"/>
+            </w:tcMar>
+          </w:tcPr>
+          <w:p>
+            <w:r>
+              <w:rPr>
+                <w:sz w:val="20"/>
+                <w:szCs w:val="20"/>
+              </w:rPr>
+              <w:t xml:space="preserve">Yes</w:t>
+            </w:r>
+          </w:p>
+        </w:tc>
+        <w:tc>
+          <w:tcPr>
+            <w:tcW w:type="dxa" w:w="1216"/>
+            <w:tcBorders>
+              <w:top w:val="single" w:color="D6D3D1" w:sz="4"/>
+              <w:left w:val="single" w:color="D6D3D1" w:sz="4"/>
+              <w:bottom w:val="single" w:color="D6D3D1" w:sz="4"/>
+              <w:right w:val="single" w:color="D6D3D1" w:sz="4"/>
+            </w:tcBorders>
+            <w:tcMar>
+              <w:top w:type="dxa" w:w="60"/>
+              <w:left w:type="dxa" w:w="100"/>
+              <w:bottom w:type="dxa" w:w="60"/>
+              <w:right w:type="dxa" w:w="100"/>
+            </w:tcMar>
+          </w:tcPr>
+          <w:p>
+            <w:r>
+              <w:rPr>
+                <w:sz w:val="20"/>
+                <w:szCs w:val="20"/>
+              </w:rPr>
+              <w:t xml:space="preserve">Yes</w:t>
+            </w:r>
+          </w:p>
+        </w:tc>
+        <w:tc>
+          <w:tcPr>
+            <w:tcW w:type="dxa" w:w="1216"/>
             <w:tcBorders>
               <w:top w:val="single" w:color="D6D3D1" w:sz="4"/>
               <w:left w:val="single" w:color="D6D3D1" w:sz="4"/>
@@ -1399,87 +1483,90 @@
         </w:tc>
         <w:tc>
           <w:tcPr>
-            <w:tcW w:type="dxa" w:w="1337"/>
-            <w:tcBorders>
-              <w:top w:val="single" w:color="D6D3D1" w:sz="4"/>
-              <w:left w:val="single" w:color="D6D3D1" w:sz="4"/>
-              <w:bottom w:val="single" w:color="D6D3D1" w:sz="4"/>
-              <w:right w:val="single" w:color="D6D3D1" w:sz="4"/>
-            </w:tcBorders>
-            <w:tcMar>
-              <w:top w:type="dxa" w:w="60"/>
-              <w:left w:type="dxa" w:w="100"/>
-              <w:bottom w:type="dxa" w:w="60"/>
-              <w:right w:type="dxa" w:w="100"/>
-            </w:tcMar>
-          </w:tcPr>
-          <w:p>
-            <w:r>
-              <w:rPr>
-                <w:sz w:val="20"/>
-                <w:szCs w:val="20"/>
-              </w:rPr>
-              <w:t xml:space="preserve">Yes</w:t>
-            </w:r>
-          </w:p>
-        </w:tc>
-        <w:tc>
-          <w:tcPr>
-            <w:tcW w:type="dxa" w:w="1337"/>
-            <w:tcBorders>
-              <w:top w:val="single" w:color="D6D3D1" w:sz="4"/>
-              <w:left w:val="single" w:color="D6D3D1" w:sz="4"/>
-              <w:bottom w:val="single" w:color="D6D3D1" w:sz="4"/>
-              <w:right w:val="single" w:color="D6D3D1" w:sz="4"/>
-            </w:tcBorders>
-            <w:tcMar>
-              <w:top w:type="dxa" w:w="60"/>
-              <w:left w:type="dxa" w:w="100"/>
-              <w:bottom w:type="dxa" w:w="60"/>
-              <w:right w:type="dxa" w:w="100"/>
-            </w:tcMar>
-          </w:tcPr>
-          <w:p>
-            <w:r>
-              <w:rPr>
-                <w:sz w:val="20"/>
-                <w:szCs w:val="20"/>
-              </w:rPr>
-              <w:t xml:space="preserve">Yes</w:t>
-            </w:r>
-          </w:p>
-        </w:tc>
-        <w:tc>
-          <w:tcPr>
-            <w:tcW w:type="dxa" w:w="1338"/>
-            <w:tcBorders>
-              <w:top w:val="single" w:color="D6D3D1" w:sz="4"/>
-              <w:left w:val="single" w:color="D6D3D1" w:sz="4"/>
-              <w:bottom w:val="single" w:color="D6D3D1" w:sz="4"/>
-              <w:right w:val="single" w:color="D6D3D1" w:sz="4"/>
-            </w:tcBorders>
-            <w:tcMar>
-              <w:top w:type="dxa" w:w="60"/>
-              <w:left w:type="dxa" w:w="100"/>
-              <w:bottom w:type="dxa" w:w="60"/>
-              <w:right w:type="dxa" w:w="100"/>
-            </w:tcMar>
-          </w:tcPr>
-          <w:p>
-            <w:r>
-              <w:rPr>
-                <w:sz w:val="20"/>
-                <w:szCs w:val="20"/>
-              </w:rPr>
-              <w:t xml:space="preserve">Yes*</w:t>
+            <w:tcW w:type="dxa" w:w="1216"/>
+            <w:tcBorders>
+              <w:top w:val="single" w:color="D6D3D1" w:sz="4"/>
+              <w:left w:val="single" w:color="D6D3D1" w:sz="4"/>
+              <w:bottom w:val="single" w:color="D6D3D1" w:sz="4"/>
+              <w:right w:val="single" w:color="D6D3D1" w:sz="4"/>
+            </w:tcBorders>
+            <w:tcMar>
+              <w:top w:type="dxa" w:w="60"/>
+              <w:left w:type="dxa" w:w="100"/>
+              <w:bottom w:type="dxa" w:w="60"/>
+              <w:right w:type="dxa" w:w="100"/>
+            </w:tcMar>
+          </w:tcPr>
+          <w:p>
+            <w:r>
+              <w:rPr>
+                <w:sz w:val="20"/>
+                <w:szCs w:val="20"/>
+              </w:rPr>
+              <w:t xml:space="preserve">Yes</w:t>
+            </w:r>
+          </w:p>
+        </w:tc>
+        <w:tc>
+          <w:tcPr>
+            <w:tcW w:type="dxa" w:w="1216"/>
+            <w:tcBorders>
+              <w:top w:val="single" w:color="D6D3D1" w:sz="4"/>
+              <w:left w:val="single" w:color="D6D3D1" w:sz="4"/>
+              <w:bottom w:val="single" w:color="D6D3D1" w:sz="4"/>
+              <w:right w:val="single" w:color="D6D3D1" w:sz="4"/>
+            </w:tcBorders>
+            <w:tcMar>
+              <w:top w:type="dxa" w:w="60"/>
+              <w:left w:type="dxa" w:w="100"/>
+              <w:bottom w:type="dxa" w:w="60"/>
+              <w:right w:type="dxa" w:w="100"/>
+            </w:tcMar>
+          </w:tcPr>
+          <w:p>
+            <w:r>
+              <w:rPr>
+                <w:sz w:val="20"/>
+                <w:szCs w:val="20"/>
+              </w:rPr>
+              <w:t xml:space="preserve">Yes</w:t>
+            </w:r>
+          </w:p>
+        </w:tc>
+        <w:tc>
+          <w:tcPr>
+            <w:tcW w:type="dxa" w:w="1221"/>
+            <w:tcBorders>
+              <w:top w:val="single" w:color="D6D3D1" w:sz="4"/>
+              <w:left w:val="single" w:color="D6D3D1" w:sz="4"/>
+              <w:bottom w:val="single" w:color="D6D3D1" w:sz="4"/>
+              <w:right w:val="single" w:color="D6D3D1" w:sz="4"/>
+            </w:tcBorders>
+            <w:tcMar>
+              <w:top w:type="dxa" w:w="60"/>
+              <w:left w:type="dxa" w:w="100"/>
+              <w:bottom w:type="dxa" w:w="60"/>
+              <w:right w:type="dxa" w:w="100"/>
+            </w:tcMar>
+          </w:tcPr>
+          <w:p>
+            <w:r>
+              <w:rPr>
+                <w:sz w:val="20"/>
+                <w:szCs w:val="20"/>
+              </w:rPr>
+              <w:t xml:space="preserve">Yes</w:t>
             </w:r>
           </w:p>
         </w:tc>
       </w:tr>
       <w:tr>
-        <w:tc>
-          <w:tcPr>
-            <w:tcW w:type="dxa" w:w="1337"/>
+        <w:trPr>
+          <w:cantSplit/>
+        </w:trPr>
+        <w:tc>
+          <w:tcPr>
+            <w:tcW w:type="dxa" w:w="2059"/>
             <w:tcBorders>
               <w:top w:val="single" w:color="D6D3D1" w:sz="4"/>
               <w:left w:val="single" w:color="D6D3D1" w:sz="4"/>
@@ -1505,59 +1592,59 @@
         </w:tc>
         <w:tc>
           <w:tcPr>
-            <w:tcW w:type="dxa" w:w="1337"/>
-            <w:tcBorders>
-              <w:top w:val="single" w:color="D6D3D1" w:sz="4"/>
-              <w:left w:val="single" w:color="D6D3D1" w:sz="4"/>
-              <w:bottom w:val="single" w:color="D6D3D1" w:sz="4"/>
-              <w:right w:val="single" w:color="D6D3D1" w:sz="4"/>
-            </w:tcBorders>
-            <w:tcMar>
-              <w:top w:type="dxa" w:w="60"/>
-              <w:left w:type="dxa" w:w="100"/>
-              <w:bottom w:type="dxa" w:w="60"/>
-              <w:right w:type="dxa" w:w="100"/>
-            </w:tcMar>
-          </w:tcPr>
-          <w:p>
-            <w:r>
-              <w:rPr>
-                <w:sz w:val="20"/>
-                <w:szCs w:val="20"/>
-              </w:rPr>
-              <w:t xml:space="preserve">Yes</w:t>
-            </w:r>
-          </w:p>
-        </w:tc>
-        <w:tc>
-          <w:tcPr>
-            <w:tcW w:type="dxa" w:w="1337"/>
-            <w:tcBorders>
-              <w:top w:val="single" w:color="D6D3D1" w:sz="4"/>
-              <w:left w:val="single" w:color="D6D3D1" w:sz="4"/>
-              <w:bottom w:val="single" w:color="D6D3D1" w:sz="4"/>
-              <w:right w:val="single" w:color="D6D3D1" w:sz="4"/>
-            </w:tcBorders>
-            <w:tcMar>
-              <w:top w:type="dxa" w:w="60"/>
-              <w:left w:type="dxa" w:w="100"/>
-              <w:bottom w:type="dxa" w:w="60"/>
-              <w:right w:type="dxa" w:w="100"/>
-            </w:tcMar>
-          </w:tcPr>
-          <w:p>
-            <w:r>
-              <w:rPr>
-                <w:sz w:val="20"/>
-                <w:szCs w:val="20"/>
-              </w:rPr>
-              <w:t xml:space="preserve">Yes</w:t>
-            </w:r>
-          </w:p>
-        </w:tc>
-        <w:tc>
-          <w:tcPr>
-            <w:tcW w:type="dxa" w:w="1337"/>
+            <w:tcW w:type="dxa" w:w="1216"/>
+            <w:tcBorders>
+              <w:top w:val="single" w:color="D6D3D1" w:sz="4"/>
+              <w:left w:val="single" w:color="D6D3D1" w:sz="4"/>
+              <w:bottom w:val="single" w:color="D6D3D1" w:sz="4"/>
+              <w:right w:val="single" w:color="D6D3D1" w:sz="4"/>
+            </w:tcBorders>
+            <w:tcMar>
+              <w:top w:type="dxa" w:w="60"/>
+              <w:left w:type="dxa" w:w="100"/>
+              <w:bottom w:type="dxa" w:w="60"/>
+              <w:right w:type="dxa" w:w="100"/>
+            </w:tcMar>
+          </w:tcPr>
+          <w:p>
+            <w:r>
+              <w:rPr>
+                <w:sz w:val="20"/>
+                <w:szCs w:val="20"/>
+              </w:rPr>
+              <w:t xml:space="preserve">Yes</w:t>
+            </w:r>
+          </w:p>
+        </w:tc>
+        <w:tc>
+          <w:tcPr>
+            <w:tcW w:type="dxa" w:w="1216"/>
+            <w:tcBorders>
+              <w:top w:val="single" w:color="D6D3D1" w:sz="4"/>
+              <w:left w:val="single" w:color="D6D3D1" w:sz="4"/>
+              <w:bottom w:val="single" w:color="D6D3D1" w:sz="4"/>
+              <w:right w:val="single" w:color="D6D3D1" w:sz="4"/>
+            </w:tcBorders>
+            <w:tcMar>
+              <w:top w:type="dxa" w:w="60"/>
+              <w:left w:type="dxa" w:w="100"/>
+              <w:bottom w:type="dxa" w:w="60"/>
+              <w:right w:type="dxa" w:w="100"/>
+            </w:tcMar>
+          </w:tcPr>
+          <w:p>
+            <w:r>
+              <w:rPr>
+                <w:sz w:val="20"/>
+                <w:szCs w:val="20"/>
+              </w:rPr>
+              <w:t xml:space="preserve">Yes</w:t>
+            </w:r>
+          </w:p>
+        </w:tc>
+        <w:tc>
+          <w:tcPr>
+            <w:tcW w:type="dxa" w:w="1216"/>
             <w:tcBorders>
               <w:top w:val="single" w:color="D6D3D1" w:sz="4"/>
               <w:left w:val="single" w:color="D6D3D1" w:sz="4"/>
@@ -1575,87 +1662,90 @@
         </w:tc>
         <w:tc>
           <w:tcPr>
-            <w:tcW w:type="dxa" w:w="1337"/>
-            <w:tcBorders>
-              <w:top w:val="single" w:color="D6D3D1" w:sz="4"/>
-              <w:left w:val="single" w:color="D6D3D1" w:sz="4"/>
-              <w:bottom w:val="single" w:color="D6D3D1" w:sz="4"/>
-              <w:right w:val="single" w:color="D6D3D1" w:sz="4"/>
-            </w:tcBorders>
-            <w:tcMar>
-              <w:top w:type="dxa" w:w="60"/>
-              <w:left w:type="dxa" w:w="100"/>
-              <w:bottom w:type="dxa" w:w="60"/>
-              <w:right w:type="dxa" w:w="100"/>
-            </w:tcMar>
-          </w:tcPr>
-          <w:p>
-            <w:r>
-              <w:rPr>
-                <w:sz w:val="20"/>
-                <w:szCs w:val="20"/>
-              </w:rPr>
-              <w:t xml:space="preserve">Yes</w:t>
-            </w:r>
-          </w:p>
-        </w:tc>
-        <w:tc>
-          <w:tcPr>
-            <w:tcW w:type="dxa" w:w="1337"/>
-            <w:tcBorders>
-              <w:top w:val="single" w:color="D6D3D1" w:sz="4"/>
-              <w:left w:val="single" w:color="D6D3D1" w:sz="4"/>
-              <w:bottom w:val="single" w:color="D6D3D1" w:sz="4"/>
-              <w:right w:val="single" w:color="D6D3D1" w:sz="4"/>
-            </w:tcBorders>
-            <w:tcMar>
-              <w:top w:type="dxa" w:w="60"/>
-              <w:left w:type="dxa" w:w="100"/>
-              <w:bottom w:type="dxa" w:w="60"/>
-              <w:right w:type="dxa" w:w="100"/>
-            </w:tcMar>
-          </w:tcPr>
-          <w:p>
-            <w:r>
-              <w:rPr>
-                <w:sz w:val="20"/>
-                <w:szCs w:val="20"/>
-              </w:rPr>
-              <w:t xml:space="preserve">Yes</w:t>
-            </w:r>
-          </w:p>
-        </w:tc>
-        <w:tc>
-          <w:tcPr>
-            <w:tcW w:type="dxa" w:w="1338"/>
-            <w:tcBorders>
-              <w:top w:val="single" w:color="D6D3D1" w:sz="4"/>
-              <w:left w:val="single" w:color="D6D3D1" w:sz="4"/>
-              <w:bottom w:val="single" w:color="D6D3D1" w:sz="4"/>
-              <w:right w:val="single" w:color="D6D3D1" w:sz="4"/>
-            </w:tcBorders>
-            <w:tcMar>
-              <w:top w:type="dxa" w:w="60"/>
-              <w:left w:type="dxa" w:w="100"/>
-              <w:bottom w:type="dxa" w:w="60"/>
-              <w:right w:type="dxa" w:w="100"/>
-            </w:tcMar>
-          </w:tcPr>
-          <w:p>
-            <w:r>
-              <w:rPr>
-                <w:sz w:val="20"/>
-                <w:szCs w:val="20"/>
-              </w:rPr>
-              <w:t xml:space="preserve">Yes*</w:t>
+            <w:tcW w:type="dxa" w:w="1216"/>
+            <w:tcBorders>
+              <w:top w:val="single" w:color="D6D3D1" w:sz="4"/>
+              <w:left w:val="single" w:color="D6D3D1" w:sz="4"/>
+              <w:bottom w:val="single" w:color="D6D3D1" w:sz="4"/>
+              <w:right w:val="single" w:color="D6D3D1" w:sz="4"/>
+            </w:tcBorders>
+            <w:tcMar>
+              <w:top w:type="dxa" w:w="60"/>
+              <w:left w:type="dxa" w:w="100"/>
+              <w:bottom w:type="dxa" w:w="60"/>
+              <w:right w:type="dxa" w:w="100"/>
+            </w:tcMar>
+          </w:tcPr>
+          <w:p>
+            <w:r>
+              <w:rPr>
+                <w:sz w:val="20"/>
+                <w:szCs w:val="20"/>
+              </w:rPr>
+              <w:t xml:space="preserve">Yes</w:t>
+            </w:r>
+          </w:p>
+        </w:tc>
+        <w:tc>
+          <w:tcPr>
+            <w:tcW w:type="dxa" w:w="1216"/>
+            <w:tcBorders>
+              <w:top w:val="single" w:color="D6D3D1" w:sz="4"/>
+              <w:left w:val="single" w:color="D6D3D1" w:sz="4"/>
+              <w:bottom w:val="single" w:color="D6D3D1" w:sz="4"/>
+              <w:right w:val="single" w:color="D6D3D1" w:sz="4"/>
+            </w:tcBorders>
+            <w:tcMar>
+              <w:top w:type="dxa" w:w="60"/>
+              <w:left w:type="dxa" w:w="100"/>
+              <w:bottom w:type="dxa" w:w="60"/>
+              <w:right w:type="dxa" w:w="100"/>
+            </w:tcMar>
+          </w:tcPr>
+          <w:p>
+            <w:r>
+              <w:rPr>
+                <w:sz w:val="20"/>
+                <w:szCs w:val="20"/>
+              </w:rPr>
+              <w:t xml:space="preserve">Yes</w:t>
+            </w:r>
+          </w:p>
+        </w:tc>
+        <w:tc>
+          <w:tcPr>
+            <w:tcW w:type="dxa" w:w="1221"/>
+            <w:tcBorders>
+              <w:top w:val="single" w:color="D6D3D1" w:sz="4"/>
+              <w:left w:val="single" w:color="D6D3D1" w:sz="4"/>
+              <w:bottom w:val="single" w:color="D6D3D1" w:sz="4"/>
+              <w:right w:val="single" w:color="D6D3D1" w:sz="4"/>
+            </w:tcBorders>
+            <w:tcMar>
+              <w:top w:type="dxa" w:w="60"/>
+              <w:left w:type="dxa" w:w="100"/>
+              <w:bottom w:type="dxa" w:w="60"/>
+              <w:right w:type="dxa" w:w="100"/>
+            </w:tcMar>
+          </w:tcPr>
+          <w:p>
+            <w:r>
+              <w:rPr>
+                <w:sz w:val="20"/>
+                <w:szCs w:val="20"/>
+              </w:rPr>
+              <w:t xml:space="preserve">Yes</w:t>
             </w:r>
           </w:p>
         </w:tc>
       </w:tr>
       <w:tr>
-        <w:tc>
-          <w:tcPr>
-            <w:tcW w:type="dxa" w:w="1337"/>
+        <w:trPr>
+          <w:cantSplit/>
+        </w:trPr>
+        <w:tc>
+          <w:tcPr>
+            <w:tcW w:type="dxa" w:w="2059"/>
             <w:tcBorders>
               <w:top w:val="single" w:color="D6D3D1" w:sz="4"/>
               <w:left w:val="single" w:color="D6D3D1" w:sz="4"/>
@@ -1681,59 +1771,59 @@
         </w:tc>
         <w:tc>
           <w:tcPr>
-            <w:tcW w:type="dxa" w:w="1337"/>
-            <w:tcBorders>
-              <w:top w:val="single" w:color="D6D3D1" w:sz="4"/>
-              <w:left w:val="single" w:color="D6D3D1" w:sz="4"/>
-              <w:bottom w:val="single" w:color="D6D3D1" w:sz="4"/>
-              <w:right w:val="single" w:color="D6D3D1" w:sz="4"/>
-            </w:tcBorders>
-            <w:tcMar>
-              <w:top w:type="dxa" w:w="60"/>
-              <w:left w:type="dxa" w:w="100"/>
-              <w:bottom w:type="dxa" w:w="60"/>
-              <w:right w:type="dxa" w:w="100"/>
-            </w:tcMar>
-          </w:tcPr>
-          <w:p>
-            <w:r>
-              <w:rPr>
-                <w:sz w:val="20"/>
-                <w:szCs w:val="20"/>
-              </w:rPr>
-              <w:t xml:space="preserve">Yes</w:t>
-            </w:r>
-          </w:p>
-        </w:tc>
-        <w:tc>
-          <w:tcPr>
-            <w:tcW w:type="dxa" w:w="1337"/>
-            <w:tcBorders>
-              <w:top w:val="single" w:color="D6D3D1" w:sz="4"/>
-              <w:left w:val="single" w:color="D6D3D1" w:sz="4"/>
-              <w:bottom w:val="single" w:color="D6D3D1" w:sz="4"/>
-              <w:right w:val="single" w:color="D6D3D1" w:sz="4"/>
-            </w:tcBorders>
-            <w:tcMar>
-              <w:top w:type="dxa" w:w="60"/>
-              <w:left w:type="dxa" w:w="100"/>
-              <w:bottom w:type="dxa" w:w="60"/>
-              <w:right w:type="dxa" w:w="100"/>
-            </w:tcMar>
-          </w:tcPr>
-          <w:p>
-            <w:r>
-              <w:rPr>
-                <w:sz w:val="20"/>
-                <w:szCs w:val="20"/>
-              </w:rPr>
-              <w:t xml:space="preserve">Yes</w:t>
-            </w:r>
-          </w:p>
-        </w:tc>
-        <w:tc>
-          <w:tcPr>
-            <w:tcW w:type="dxa" w:w="1337"/>
+            <w:tcW w:type="dxa" w:w="1216"/>
+            <w:tcBorders>
+              <w:top w:val="single" w:color="D6D3D1" w:sz="4"/>
+              <w:left w:val="single" w:color="D6D3D1" w:sz="4"/>
+              <w:bottom w:val="single" w:color="D6D3D1" w:sz="4"/>
+              <w:right w:val="single" w:color="D6D3D1" w:sz="4"/>
+            </w:tcBorders>
+            <w:tcMar>
+              <w:top w:type="dxa" w:w="60"/>
+              <w:left w:type="dxa" w:w="100"/>
+              <w:bottom w:type="dxa" w:w="60"/>
+              <w:right w:type="dxa" w:w="100"/>
+            </w:tcMar>
+          </w:tcPr>
+          <w:p>
+            <w:r>
+              <w:rPr>
+                <w:sz w:val="20"/>
+                <w:szCs w:val="20"/>
+              </w:rPr>
+              <w:t xml:space="preserve">Yes</w:t>
+            </w:r>
+          </w:p>
+        </w:tc>
+        <w:tc>
+          <w:tcPr>
+            <w:tcW w:type="dxa" w:w="1216"/>
+            <w:tcBorders>
+              <w:top w:val="single" w:color="D6D3D1" w:sz="4"/>
+              <w:left w:val="single" w:color="D6D3D1" w:sz="4"/>
+              <w:bottom w:val="single" w:color="D6D3D1" w:sz="4"/>
+              <w:right w:val="single" w:color="D6D3D1" w:sz="4"/>
+            </w:tcBorders>
+            <w:tcMar>
+              <w:top w:type="dxa" w:w="60"/>
+              <w:left w:type="dxa" w:w="100"/>
+              <w:bottom w:type="dxa" w:w="60"/>
+              <w:right w:type="dxa" w:w="100"/>
+            </w:tcMar>
+          </w:tcPr>
+          <w:p>
+            <w:r>
+              <w:rPr>
+                <w:sz w:val="20"/>
+                <w:szCs w:val="20"/>
+              </w:rPr>
+              <w:t xml:space="preserve">Yes</w:t>
+            </w:r>
+          </w:p>
+        </w:tc>
+        <w:tc>
+          <w:tcPr>
+            <w:tcW w:type="dxa" w:w="1216"/>
             <w:tcBorders>
               <w:top w:val="single" w:color="D6D3D1" w:sz="4"/>
               <w:left w:val="single" w:color="D6D3D1" w:sz="4"/>
@@ -1751,87 +1841,90 @@
         </w:tc>
         <w:tc>
           <w:tcPr>
-            <w:tcW w:type="dxa" w:w="1337"/>
-            <w:tcBorders>
-              <w:top w:val="single" w:color="D6D3D1" w:sz="4"/>
-              <w:left w:val="single" w:color="D6D3D1" w:sz="4"/>
-              <w:bottom w:val="single" w:color="D6D3D1" w:sz="4"/>
-              <w:right w:val="single" w:color="D6D3D1" w:sz="4"/>
-            </w:tcBorders>
-            <w:tcMar>
-              <w:top w:type="dxa" w:w="60"/>
-              <w:left w:type="dxa" w:w="100"/>
-              <w:bottom w:type="dxa" w:w="60"/>
-              <w:right w:type="dxa" w:w="100"/>
-            </w:tcMar>
-          </w:tcPr>
-          <w:p>
-            <w:r>
-              <w:rPr>
-                <w:sz w:val="20"/>
-                <w:szCs w:val="20"/>
-              </w:rPr>
-              <w:t xml:space="preserve">Yes</w:t>
-            </w:r>
-          </w:p>
-        </w:tc>
-        <w:tc>
-          <w:tcPr>
-            <w:tcW w:type="dxa" w:w="1337"/>
-            <w:tcBorders>
-              <w:top w:val="single" w:color="D6D3D1" w:sz="4"/>
-              <w:left w:val="single" w:color="D6D3D1" w:sz="4"/>
-              <w:bottom w:val="single" w:color="D6D3D1" w:sz="4"/>
-              <w:right w:val="single" w:color="D6D3D1" w:sz="4"/>
-            </w:tcBorders>
-            <w:tcMar>
-              <w:top w:type="dxa" w:w="60"/>
-              <w:left w:type="dxa" w:w="100"/>
-              <w:bottom w:type="dxa" w:w="60"/>
-              <w:right w:type="dxa" w:w="100"/>
-            </w:tcMar>
-          </w:tcPr>
-          <w:p>
-            <w:r>
-              <w:rPr>
-                <w:sz w:val="20"/>
-                <w:szCs w:val="20"/>
-              </w:rPr>
-              <w:t xml:space="preserve">Yes</w:t>
-            </w:r>
-          </w:p>
-        </w:tc>
-        <w:tc>
-          <w:tcPr>
-            <w:tcW w:type="dxa" w:w="1338"/>
-            <w:tcBorders>
-              <w:top w:val="single" w:color="D6D3D1" w:sz="4"/>
-              <w:left w:val="single" w:color="D6D3D1" w:sz="4"/>
-              <w:bottom w:val="single" w:color="D6D3D1" w:sz="4"/>
-              <w:right w:val="single" w:color="D6D3D1" w:sz="4"/>
-            </w:tcBorders>
-            <w:tcMar>
-              <w:top w:type="dxa" w:w="60"/>
-              <w:left w:type="dxa" w:w="100"/>
-              <w:bottom w:type="dxa" w:w="60"/>
-              <w:right w:type="dxa" w:w="100"/>
-            </w:tcMar>
-          </w:tcPr>
-          <w:p>
-            <w:r>
-              <w:rPr>
-                <w:sz w:val="20"/>
-                <w:szCs w:val="20"/>
-              </w:rPr>
-              <w:t xml:space="preserve">Yes*</w:t>
+            <w:tcW w:type="dxa" w:w="1216"/>
+            <w:tcBorders>
+              <w:top w:val="single" w:color="D6D3D1" w:sz="4"/>
+              <w:left w:val="single" w:color="D6D3D1" w:sz="4"/>
+              <w:bottom w:val="single" w:color="D6D3D1" w:sz="4"/>
+              <w:right w:val="single" w:color="D6D3D1" w:sz="4"/>
+            </w:tcBorders>
+            <w:tcMar>
+              <w:top w:type="dxa" w:w="60"/>
+              <w:left w:type="dxa" w:w="100"/>
+              <w:bottom w:type="dxa" w:w="60"/>
+              <w:right w:type="dxa" w:w="100"/>
+            </w:tcMar>
+          </w:tcPr>
+          <w:p>
+            <w:r>
+              <w:rPr>
+                <w:sz w:val="20"/>
+                <w:szCs w:val="20"/>
+              </w:rPr>
+              <w:t xml:space="preserve">Yes</w:t>
+            </w:r>
+          </w:p>
+        </w:tc>
+        <w:tc>
+          <w:tcPr>
+            <w:tcW w:type="dxa" w:w="1216"/>
+            <w:tcBorders>
+              <w:top w:val="single" w:color="D6D3D1" w:sz="4"/>
+              <w:left w:val="single" w:color="D6D3D1" w:sz="4"/>
+              <w:bottom w:val="single" w:color="D6D3D1" w:sz="4"/>
+              <w:right w:val="single" w:color="D6D3D1" w:sz="4"/>
+            </w:tcBorders>
+            <w:tcMar>
+              <w:top w:type="dxa" w:w="60"/>
+              <w:left w:type="dxa" w:w="100"/>
+              <w:bottom w:type="dxa" w:w="60"/>
+              <w:right w:type="dxa" w:w="100"/>
+            </w:tcMar>
+          </w:tcPr>
+          <w:p>
+            <w:r>
+              <w:rPr>
+                <w:sz w:val="20"/>
+                <w:szCs w:val="20"/>
+              </w:rPr>
+              <w:t xml:space="preserve">Yes</w:t>
+            </w:r>
+          </w:p>
+        </w:tc>
+        <w:tc>
+          <w:tcPr>
+            <w:tcW w:type="dxa" w:w="1221"/>
+            <w:tcBorders>
+              <w:top w:val="single" w:color="D6D3D1" w:sz="4"/>
+              <w:left w:val="single" w:color="D6D3D1" w:sz="4"/>
+              <w:bottom w:val="single" w:color="D6D3D1" w:sz="4"/>
+              <w:right w:val="single" w:color="D6D3D1" w:sz="4"/>
+            </w:tcBorders>
+            <w:tcMar>
+              <w:top w:type="dxa" w:w="60"/>
+              <w:left w:type="dxa" w:w="100"/>
+              <w:bottom w:type="dxa" w:w="60"/>
+              <w:right w:type="dxa" w:w="100"/>
+            </w:tcMar>
+          </w:tcPr>
+          <w:p>
+            <w:r>
+              <w:rPr>
+                <w:sz w:val="20"/>
+                <w:szCs w:val="20"/>
+              </w:rPr>
+              <w:t xml:space="preserve">Yes</w:t>
             </w:r>
           </w:p>
         </w:tc>
       </w:tr>
       <w:tr>
-        <w:tc>
-          <w:tcPr>
-            <w:tcW w:type="dxa" w:w="1337"/>
+        <w:trPr>
+          <w:cantSplit/>
+        </w:trPr>
+        <w:tc>
+          <w:tcPr>
+            <w:tcW w:type="dxa" w:w="2059"/>
             <w:tcBorders>
               <w:top w:val="single" w:color="D6D3D1" w:sz="4"/>
               <w:left w:val="single" w:color="D6D3D1" w:sz="4"/>
@@ -1857,165 +1950,168 @@
         </w:tc>
         <w:tc>
           <w:tcPr>
-            <w:tcW w:type="dxa" w:w="1337"/>
-            <w:tcBorders>
-              <w:top w:val="single" w:color="D6D3D1" w:sz="4"/>
-              <w:left w:val="single" w:color="D6D3D1" w:sz="4"/>
-              <w:bottom w:val="single" w:color="D6D3D1" w:sz="4"/>
-              <w:right w:val="single" w:color="D6D3D1" w:sz="4"/>
-            </w:tcBorders>
-            <w:tcMar>
-              <w:top w:type="dxa" w:w="60"/>
-              <w:left w:type="dxa" w:w="100"/>
-              <w:bottom w:type="dxa" w:w="60"/>
-              <w:right w:type="dxa" w:w="100"/>
-            </w:tcMar>
-          </w:tcPr>
-          <w:p>
-            <w:r>
-              <w:rPr>
-                <w:sz w:val="20"/>
-                <w:szCs w:val="20"/>
-              </w:rPr>
-              <w:t xml:space="preserve">Yes</w:t>
-            </w:r>
-          </w:p>
-        </w:tc>
-        <w:tc>
-          <w:tcPr>
-            <w:tcW w:type="dxa" w:w="1337"/>
-            <w:tcBorders>
-              <w:top w:val="single" w:color="D6D3D1" w:sz="4"/>
-              <w:left w:val="single" w:color="D6D3D1" w:sz="4"/>
-              <w:bottom w:val="single" w:color="D6D3D1" w:sz="4"/>
-              <w:right w:val="single" w:color="D6D3D1" w:sz="4"/>
-            </w:tcBorders>
-            <w:tcMar>
-              <w:top w:type="dxa" w:w="60"/>
-              <w:left w:type="dxa" w:w="100"/>
-              <w:bottom w:type="dxa" w:w="60"/>
-              <w:right w:type="dxa" w:w="100"/>
-            </w:tcMar>
-          </w:tcPr>
-          <w:p>
-            <w:r>
-              <w:rPr>
-                <w:sz w:val="20"/>
-                <w:szCs w:val="20"/>
-              </w:rPr>
-              <w:t xml:space="preserve">Yes</w:t>
-            </w:r>
-          </w:p>
-        </w:tc>
-        <w:tc>
-          <w:tcPr>
-            <w:tcW w:type="dxa" w:w="1337"/>
-            <w:tcBorders>
-              <w:top w:val="single" w:color="D6D3D1" w:sz="4"/>
-              <w:left w:val="single" w:color="D6D3D1" w:sz="4"/>
-              <w:bottom w:val="single" w:color="D6D3D1" w:sz="4"/>
-              <w:right w:val="single" w:color="D6D3D1" w:sz="4"/>
-            </w:tcBorders>
-            <w:tcMar>
-              <w:top w:type="dxa" w:w="60"/>
-              <w:left w:type="dxa" w:w="100"/>
-              <w:bottom w:type="dxa" w:w="60"/>
-              <w:right w:type="dxa" w:w="100"/>
-            </w:tcMar>
-          </w:tcPr>
-          <w:p>
-            <w:r>
-              <w:rPr>
-                <w:sz w:val="20"/>
-                <w:szCs w:val="20"/>
-              </w:rPr>
-              <w:t xml:space="preserve">Yes</w:t>
-            </w:r>
-          </w:p>
-        </w:tc>
-        <w:tc>
-          <w:tcPr>
-            <w:tcW w:type="dxa" w:w="1337"/>
-            <w:tcBorders>
-              <w:top w:val="single" w:color="D6D3D1" w:sz="4"/>
-              <w:left w:val="single" w:color="D6D3D1" w:sz="4"/>
-              <w:bottom w:val="single" w:color="D6D3D1" w:sz="4"/>
-              <w:right w:val="single" w:color="D6D3D1" w:sz="4"/>
-            </w:tcBorders>
-            <w:tcMar>
-              <w:top w:type="dxa" w:w="60"/>
-              <w:left w:type="dxa" w:w="100"/>
-              <w:bottom w:type="dxa" w:w="60"/>
-              <w:right w:type="dxa" w:w="100"/>
-            </w:tcMar>
-          </w:tcPr>
-          <w:p>
-            <w:r>
-              <w:rPr>
-                <w:sz w:val="20"/>
-                <w:szCs w:val="20"/>
-              </w:rPr>
-              <w:t xml:space="preserve">Yes</w:t>
-            </w:r>
-          </w:p>
-        </w:tc>
-        <w:tc>
-          <w:tcPr>
-            <w:tcW w:type="dxa" w:w="1337"/>
-            <w:tcBorders>
-              <w:top w:val="single" w:color="D6D3D1" w:sz="4"/>
-              <w:left w:val="single" w:color="D6D3D1" w:sz="4"/>
-              <w:bottom w:val="single" w:color="D6D3D1" w:sz="4"/>
-              <w:right w:val="single" w:color="D6D3D1" w:sz="4"/>
-            </w:tcBorders>
-            <w:tcMar>
-              <w:top w:type="dxa" w:w="60"/>
-              <w:left w:type="dxa" w:w="100"/>
-              <w:bottom w:type="dxa" w:w="60"/>
-              <w:right w:type="dxa" w:w="100"/>
-            </w:tcMar>
-          </w:tcPr>
-          <w:p>
-            <w:r>
-              <w:rPr>
-                <w:sz w:val="20"/>
-                <w:szCs w:val="20"/>
-              </w:rPr>
-              <w:t xml:space="preserve">Yes</w:t>
-            </w:r>
-          </w:p>
-        </w:tc>
-        <w:tc>
-          <w:tcPr>
-            <w:tcW w:type="dxa" w:w="1338"/>
-            <w:tcBorders>
-              <w:top w:val="single" w:color="D6D3D1" w:sz="4"/>
-              <w:left w:val="single" w:color="D6D3D1" w:sz="4"/>
-              <w:bottom w:val="single" w:color="D6D3D1" w:sz="4"/>
-              <w:right w:val="single" w:color="D6D3D1" w:sz="4"/>
-            </w:tcBorders>
-            <w:tcMar>
-              <w:top w:type="dxa" w:w="60"/>
-              <w:left w:type="dxa" w:w="100"/>
-              <w:bottom w:type="dxa" w:w="60"/>
-              <w:right w:type="dxa" w:w="100"/>
-            </w:tcMar>
-          </w:tcPr>
-          <w:p>
-            <w:r>
-              <w:rPr>
-                <w:sz w:val="20"/>
-                <w:szCs w:val="20"/>
-              </w:rPr>
-              <w:t xml:space="preserve">Yes*</w:t>
+            <w:tcW w:type="dxa" w:w="1216"/>
+            <w:tcBorders>
+              <w:top w:val="single" w:color="D6D3D1" w:sz="4"/>
+              <w:left w:val="single" w:color="D6D3D1" w:sz="4"/>
+              <w:bottom w:val="single" w:color="D6D3D1" w:sz="4"/>
+              <w:right w:val="single" w:color="D6D3D1" w:sz="4"/>
+            </w:tcBorders>
+            <w:tcMar>
+              <w:top w:type="dxa" w:w="60"/>
+              <w:left w:type="dxa" w:w="100"/>
+              <w:bottom w:type="dxa" w:w="60"/>
+              <w:right w:type="dxa" w:w="100"/>
+            </w:tcMar>
+          </w:tcPr>
+          <w:p>
+            <w:r>
+              <w:rPr>
+                <w:sz w:val="20"/>
+                <w:szCs w:val="20"/>
+              </w:rPr>
+              <w:t xml:space="preserve">Yes</w:t>
+            </w:r>
+          </w:p>
+        </w:tc>
+        <w:tc>
+          <w:tcPr>
+            <w:tcW w:type="dxa" w:w="1216"/>
+            <w:tcBorders>
+              <w:top w:val="single" w:color="D6D3D1" w:sz="4"/>
+              <w:left w:val="single" w:color="D6D3D1" w:sz="4"/>
+              <w:bottom w:val="single" w:color="D6D3D1" w:sz="4"/>
+              <w:right w:val="single" w:color="D6D3D1" w:sz="4"/>
+            </w:tcBorders>
+            <w:tcMar>
+              <w:top w:type="dxa" w:w="60"/>
+              <w:left w:type="dxa" w:w="100"/>
+              <w:bottom w:type="dxa" w:w="60"/>
+              <w:right w:type="dxa" w:w="100"/>
+            </w:tcMar>
+          </w:tcPr>
+          <w:p>
+            <w:r>
+              <w:rPr>
+                <w:sz w:val="20"/>
+                <w:szCs w:val="20"/>
+              </w:rPr>
+              <w:t xml:space="preserve">Yes</w:t>
+            </w:r>
+          </w:p>
+        </w:tc>
+        <w:tc>
+          <w:tcPr>
+            <w:tcW w:type="dxa" w:w="1216"/>
+            <w:tcBorders>
+              <w:top w:val="single" w:color="D6D3D1" w:sz="4"/>
+              <w:left w:val="single" w:color="D6D3D1" w:sz="4"/>
+              <w:bottom w:val="single" w:color="D6D3D1" w:sz="4"/>
+              <w:right w:val="single" w:color="D6D3D1" w:sz="4"/>
+            </w:tcBorders>
+            <w:tcMar>
+              <w:top w:type="dxa" w:w="60"/>
+              <w:left w:type="dxa" w:w="100"/>
+              <w:bottom w:type="dxa" w:w="60"/>
+              <w:right w:type="dxa" w:w="100"/>
+            </w:tcMar>
+          </w:tcPr>
+          <w:p>
+            <w:r>
+              <w:rPr>
+                <w:sz w:val="20"/>
+                <w:szCs w:val="20"/>
+              </w:rPr>
+              <w:t xml:space="preserve">Yes</w:t>
+            </w:r>
+          </w:p>
+        </w:tc>
+        <w:tc>
+          <w:tcPr>
+            <w:tcW w:type="dxa" w:w="1216"/>
+            <w:tcBorders>
+              <w:top w:val="single" w:color="D6D3D1" w:sz="4"/>
+              <w:left w:val="single" w:color="D6D3D1" w:sz="4"/>
+              <w:bottom w:val="single" w:color="D6D3D1" w:sz="4"/>
+              <w:right w:val="single" w:color="D6D3D1" w:sz="4"/>
+            </w:tcBorders>
+            <w:tcMar>
+              <w:top w:type="dxa" w:w="60"/>
+              <w:left w:type="dxa" w:w="100"/>
+              <w:bottom w:type="dxa" w:w="60"/>
+              <w:right w:type="dxa" w:w="100"/>
+            </w:tcMar>
+          </w:tcPr>
+          <w:p>
+            <w:r>
+              <w:rPr>
+                <w:sz w:val="20"/>
+                <w:szCs w:val="20"/>
+              </w:rPr>
+              <w:t xml:space="preserve">Yes</w:t>
+            </w:r>
+          </w:p>
+        </w:tc>
+        <w:tc>
+          <w:tcPr>
+            <w:tcW w:type="dxa" w:w="1216"/>
+            <w:tcBorders>
+              <w:top w:val="single" w:color="D6D3D1" w:sz="4"/>
+              <w:left w:val="single" w:color="D6D3D1" w:sz="4"/>
+              <w:bottom w:val="single" w:color="D6D3D1" w:sz="4"/>
+              <w:right w:val="single" w:color="D6D3D1" w:sz="4"/>
+            </w:tcBorders>
+            <w:tcMar>
+              <w:top w:type="dxa" w:w="60"/>
+              <w:left w:type="dxa" w:w="100"/>
+              <w:bottom w:type="dxa" w:w="60"/>
+              <w:right w:type="dxa" w:w="100"/>
+            </w:tcMar>
+          </w:tcPr>
+          <w:p>
+            <w:r>
+              <w:rPr>
+                <w:sz w:val="20"/>
+                <w:szCs w:val="20"/>
+              </w:rPr>
+              <w:t xml:space="preserve">Yes</w:t>
+            </w:r>
+          </w:p>
+        </w:tc>
+        <w:tc>
+          <w:tcPr>
+            <w:tcW w:type="dxa" w:w="1221"/>
+            <w:tcBorders>
+              <w:top w:val="single" w:color="D6D3D1" w:sz="4"/>
+              <w:left w:val="single" w:color="D6D3D1" w:sz="4"/>
+              <w:bottom w:val="single" w:color="D6D3D1" w:sz="4"/>
+              <w:right w:val="single" w:color="D6D3D1" w:sz="4"/>
+            </w:tcBorders>
+            <w:tcMar>
+              <w:top w:type="dxa" w:w="60"/>
+              <w:left w:type="dxa" w:w="100"/>
+              <w:bottom w:type="dxa" w:w="60"/>
+              <w:right w:type="dxa" w:w="100"/>
+            </w:tcMar>
+          </w:tcPr>
+          <w:p>
+            <w:r>
+              <w:rPr>
+                <w:sz w:val="20"/>
+                <w:szCs w:val="20"/>
+              </w:rPr>
+              <w:t xml:space="preserve">Yes</w:t>
             </w:r>
           </w:p>
         </w:tc>
       </w:tr>
       <w:tr>
-        <w:tc>
-          <w:tcPr>
-            <w:tcW w:type="dxa" w:w="1337"/>
+        <w:trPr>
+          <w:cantSplit/>
+        </w:trPr>
+        <w:tc>
+          <w:tcPr>
+            <w:tcW w:type="dxa" w:w="2059"/>
             <w:tcBorders>
               <w:top w:val="single" w:color="D6D3D1" w:sz="4"/>
               <w:left w:val="single" w:color="D6D3D1" w:sz="4"/>
@@ -2041,59 +2137,59 @@
         </w:tc>
         <w:tc>
           <w:tcPr>
-            <w:tcW w:type="dxa" w:w="1337"/>
-            <w:tcBorders>
-              <w:top w:val="single" w:color="D6D3D1" w:sz="4"/>
-              <w:left w:val="single" w:color="D6D3D1" w:sz="4"/>
-              <w:bottom w:val="single" w:color="D6D3D1" w:sz="4"/>
-              <w:right w:val="single" w:color="D6D3D1" w:sz="4"/>
-            </w:tcBorders>
-            <w:tcMar>
-              <w:top w:type="dxa" w:w="60"/>
-              <w:left w:type="dxa" w:w="100"/>
-              <w:bottom w:type="dxa" w:w="60"/>
-              <w:right w:type="dxa" w:w="100"/>
-            </w:tcMar>
-          </w:tcPr>
-          <w:p>
-            <w:r>
-              <w:rPr>
-                <w:sz w:val="20"/>
-                <w:szCs w:val="20"/>
-              </w:rPr>
-              <w:t xml:space="preserve">Yes</w:t>
-            </w:r>
-          </w:p>
-        </w:tc>
-        <w:tc>
-          <w:tcPr>
-            <w:tcW w:type="dxa" w:w="1337"/>
-            <w:tcBorders>
-              <w:top w:val="single" w:color="D6D3D1" w:sz="4"/>
-              <w:left w:val="single" w:color="D6D3D1" w:sz="4"/>
-              <w:bottom w:val="single" w:color="D6D3D1" w:sz="4"/>
-              <w:right w:val="single" w:color="D6D3D1" w:sz="4"/>
-            </w:tcBorders>
-            <w:tcMar>
-              <w:top w:type="dxa" w:w="60"/>
-              <w:left w:type="dxa" w:w="100"/>
-              <w:bottom w:type="dxa" w:w="60"/>
-              <w:right w:type="dxa" w:w="100"/>
-            </w:tcMar>
-          </w:tcPr>
-          <w:p>
-            <w:r>
-              <w:rPr>
-                <w:sz w:val="20"/>
-                <w:szCs w:val="20"/>
-              </w:rPr>
-              <w:t xml:space="preserve">Yes</w:t>
-            </w:r>
-          </w:p>
-        </w:tc>
-        <w:tc>
-          <w:tcPr>
-            <w:tcW w:type="dxa" w:w="1337"/>
+            <w:tcW w:type="dxa" w:w="1216"/>
+            <w:tcBorders>
+              <w:top w:val="single" w:color="D6D3D1" w:sz="4"/>
+              <w:left w:val="single" w:color="D6D3D1" w:sz="4"/>
+              <w:bottom w:val="single" w:color="D6D3D1" w:sz="4"/>
+              <w:right w:val="single" w:color="D6D3D1" w:sz="4"/>
+            </w:tcBorders>
+            <w:tcMar>
+              <w:top w:type="dxa" w:w="60"/>
+              <w:left w:type="dxa" w:w="100"/>
+              <w:bottom w:type="dxa" w:w="60"/>
+              <w:right w:type="dxa" w:w="100"/>
+            </w:tcMar>
+          </w:tcPr>
+          <w:p>
+            <w:r>
+              <w:rPr>
+                <w:sz w:val="20"/>
+                <w:szCs w:val="20"/>
+              </w:rPr>
+              <w:t xml:space="preserve">Yes</w:t>
+            </w:r>
+          </w:p>
+        </w:tc>
+        <w:tc>
+          <w:tcPr>
+            <w:tcW w:type="dxa" w:w="1216"/>
+            <w:tcBorders>
+              <w:top w:val="single" w:color="D6D3D1" w:sz="4"/>
+              <w:left w:val="single" w:color="D6D3D1" w:sz="4"/>
+              <w:bottom w:val="single" w:color="D6D3D1" w:sz="4"/>
+              <w:right w:val="single" w:color="D6D3D1" w:sz="4"/>
+            </w:tcBorders>
+            <w:tcMar>
+              <w:top w:type="dxa" w:w="60"/>
+              <w:left w:type="dxa" w:w="100"/>
+              <w:bottom w:type="dxa" w:w="60"/>
+              <w:right w:type="dxa" w:w="100"/>
+            </w:tcMar>
+          </w:tcPr>
+          <w:p>
+            <w:r>
+              <w:rPr>
+                <w:sz w:val="20"/>
+                <w:szCs w:val="20"/>
+              </w:rPr>
+              <w:t xml:space="preserve">Yes</w:t>
+            </w:r>
+          </w:p>
+        </w:tc>
+        <w:tc>
+          <w:tcPr>
+            <w:tcW w:type="dxa" w:w="1216"/>
             <w:tcBorders>
               <w:top w:val="single" w:color="D6D3D1" w:sz="4"/>
               <w:left w:val="single" w:color="D6D3D1" w:sz="4"/>
@@ -2111,87 +2207,90 @@
         </w:tc>
         <w:tc>
           <w:tcPr>
-            <w:tcW w:type="dxa" w:w="1337"/>
-            <w:tcBorders>
-              <w:top w:val="single" w:color="D6D3D1" w:sz="4"/>
-              <w:left w:val="single" w:color="D6D3D1" w:sz="4"/>
-              <w:bottom w:val="single" w:color="D6D3D1" w:sz="4"/>
-              <w:right w:val="single" w:color="D6D3D1" w:sz="4"/>
-            </w:tcBorders>
-            <w:tcMar>
-              <w:top w:type="dxa" w:w="60"/>
-              <w:left w:type="dxa" w:w="100"/>
-              <w:bottom w:type="dxa" w:w="60"/>
-              <w:right w:type="dxa" w:w="100"/>
-            </w:tcMar>
-          </w:tcPr>
-          <w:p>
-            <w:r>
-              <w:rPr>
-                <w:sz w:val="20"/>
-                <w:szCs w:val="20"/>
-              </w:rPr>
-              <w:t xml:space="preserve">Yes</w:t>
-            </w:r>
-          </w:p>
-        </w:tc>
-        <w:tc>
-          <w:tcPr>
-            <w:tcW w:type="dxa" w:w="1337"/>
-            <w:tcBorders>
-              <w:top w:val="single" w:color="D6D3D1" w:sz="4"/>
-              <w:left w:val="single" w:color="D6D3D1" w:sz="4"/>
-              <w:bottom w:val="single" w:color="D6D3D1" w:sz="4"/>
-              <w:right w:val="single" w:color="D6D3D1" w:sz="4"/>
-            </w:tcBorders>
-            <w:tcMar>
-              <w:top w:type="dxa" w:w="60"/>
-              <w:left w:type="dxa" w:w="100"/>
-              <w:bottom w:type="dxa" w:w="60"/>
-              <w:right w:type="dxa" w:w="100"/>
-            </w:tcMar>
-          </w:tcPr>
-          <w:p>
-            <w:r>
-              <w:rPr>
-                <w:sz w:val="20"/>
-                <w:szCs w:val="20"/>
-              </w:rPr>
-              <w:t xml:space="preserve">Yes</w:t>
-            </w:r>
-          </w:p>
-        </w:tc>
-        <w:tc>
-          <w:tcPr>
-            <w:tcW w:type="dxa" w:w="1338"/>
-            <w:tcBorders>
-              <w:top w:val="single" w:color="D6D3D1" w:sz="4"/>
-              <w:left w:val="single" w:color="D6D3D1" w:sz="4"/>
-              <w:bottom w:val="single" w:color="D6D3D1" w:sz="4"/>
-              <w:right w:val="single" w:color="D6D3D1" w:sz="4"/>
-            </w:tcBorders>
-            <w:tcMar>
-              <w:top w:type="dxa" w:w="60"/>
-              <w:left w:type="dxa" w:w="100"/>
-              <w:bottom w:type="dxa" w:w="60"/>
-              <w:right w:type="dxa" w:w="100"/>
-            </w:tcMar>
-          </w:tcPr>
-          <w:p>
-            <w:r>
-              <w:rPr>
-                <w:sz w:val="20"/>
-                <w:szCs w:val="20"/>
-              </w:rPr>
-              <w:t xml:space="preserve">Yes*</w:t>
+            <w:tcW w:type="dxa" w:w="1216"/>
+            <w:tcBorders>
+              <w:top w:val="single" w:color="D6D3D1" w:sz="4"/>
+              <w:left w:val="single" w:color="D6D3D1" w:sz="4"/>
+              <w:bottom w:val="single" w:color="D6D3D1" w:sz="4"/>
+              <w:right w:val="single" w:color="D6D3D1" w:sz="4"/>
+            </w:tcBorders>
+            <w:tcMar>
+              <w:top w:type="dxa" w:w="60"/>
+              <w:left w:type="dxa" w:w="100"/>
+              <w:bottom w:type="dxa" w:w="60"/>
+              <w:right w:type="dxa" w:w="100"/>
+            </w:tcMar>
+          </w:tcPr>
+          <w:p>
+            <w:r>
+              <w:rPr>
+                <w:sz w:val="20"/>
+                <w:szCs w:val="20"/>
+              </w:rPr>
+              <w:t xml:space="preserve">Yes</w:t>
+            </w:r>
+          </w:p>
+        </w:tc>
+        <w:tc>
+          <w:tcPr>
+            <w:tcW w:type="dxa" w:w="1216"/>
+            <w:tcBorders>
+              <w:top w:val="single" w:color="D6D3D1" w:sz="4"/>
+              <w:left w:val="single" w:color="D6D3D1" w:sz="4"/>
+              <w:bottom w:val="single" w:color="D6D3D1" w:sz="4"/>
+              <w:right w:val="single" w:color="D6D3D1" w:sz="4"/>
+            </w:tcBorders>
+            <w:tcMar>
+              <w:top w:type="dxa" w:w="60"/>
+              <w:left w:type="dxa" w:w="100"/>
+              <w:bottom w:type="dxa" w:w="60"/>
+              <w:right w:type="dxa" w:w="100"/>
+            </w:tcMar>
+          </w:tcPr>
+          <w:p>
+            <w:r>
+              <w:rPr>
+                <w:sz w:val="20"/>
+                <w:szCs w:val="20"/>
+              </w:rPr>
+              <w:t xml:space="preserve">Yes</w:t>
+            </w:r>
+          </w:p>
+        </w:tc>
+        <w:tc>
+          <w:tcPr>
+            <w:tcW w:type="dxa" w:w="1221"/>
+            <w:tcBorders>
+              <w:top w:val="single" w:color="D6D3D1" w:sz="4"/>
+              <w:left w:val="single" w:color="D6D3D1" w:sz="4"/>
+              <w:bottom w:val="single" w:color="D6D3D1" w:sz="4"/>
+              <w:right w:val="single" w:color="D6D3D1" w:sz="4"/>
+            </w:tcBorders>
+            <w:tcMar>
+              <w:top w:type="dxa" w:w="60"/>
+              <w:left w:type="dxa" w:w="100"/>
+              <w:bottom w:type="dxa" w:w="60"/>
+              <w:right w:type="dxa" w:w="100"/>
+            </w:tcMar>
+          </w:tcPr>
+          <w:p>
+            <w:r>
+              <w:rPr>
+                <w:sz w:val="20"/>
+                <w:szCs w:val="20"/>
+              </w:rPr>
+              <w:t xml:space="preserve">Yes</w:t>
             </w:r>
           </w:p>
         </w:tc>
       </w:tr>
       <w:tr>
-        <w:tc>
-          <w:tcPr>
-            <w:tcW w:type="dxa" w:w="1337"/>
+        <w:trPr>
+          <w:cantSplit/>
+        </w:trPr>
+        <w:tc>
+          <w:tcPr>
+            <w:tcW w:type="dxa" w:w="2059"/>
             <w:tcBorders>
               <w:top w:val="single" w:color="D6D3D1" w:sz="4"/>
               <w:left w:val="single" w:color="D6D3D1" w:sz="4"/>
@@ -2217,33 +2316,33 @@
         </w:tc>
         <w:tc>
           <w:tcPr>
-            <w:tcW w:type="dxa" w:w="1337"/>
-            <w:tcBorders>
-              <w:top w:val="single" w:color="D6D3D1" w:sz="4"/>
-              <w:left w:val="single" w:color="D6D3D1" w:sz="4"/>
-              <w:bottom w:val="single" w:color="D6D3D1" w:sz="4"/>
-              <w:right w:val="single" w:color="D6D3D1" w:sz="4"/>
-            </w:tcBorders>
-            <w:tcMar>
-              <w:top w:type="dxa" w:w="60"/>
-              <w:left w:type="dxa" w:w="100"/>
-              <w:bottom w:type="dxa" w:w="60"/>
-              <w:right w:type="dxa" w:w="100"/>
-            </w:tcMar>
-          </w:tcPr>
-          <w:p>
-            <w:r>
-              <w:rPr>
-                <w:sz w:val="20"/>
-                <w:szCs w:val="20"/>
-              </w:rPr>
-              <w:t xml:space="preserve">Yes</w:t>
-            </w:r>
-          </w:p>
-        </w:tc>
-        <w:tc>
-          <w:tcPr>
-            <w:tcW w:type="dxa" w:w="1337"/>
+            <w:tcW w:type="dxa" w:w="1216"/>
+            <w:tcBorders>
+              <w:top w:val="single" w:color="D6D3D1" w:sz="4"/>
+              <w:left w:val="single" w:color="D6D3D1" w:sz="4"/>
+              <w:bottom w:val="single" w:color="D6D3D1" w:sz="4"/>
+              <w:right w:val="single" w:color="D6D3D1" w:sz="4"/>
+            </w:tcBorders>
+            <w:tcMar>
+              <w:top w:type="dxa" w:w="60"/>
+              <w:left w:type="dxa" w:w="100"/>
+              <w:bottom w:type="dxa" w:w="60"/>
+              <w:right w:type="dxa" w:w="100"/>
+            </w:tcMar>
+          </w:tcPr>
+          <w:p>
+            <w:r>
+              <w:rPr>
+                <w:sz w:val="20"/>
+                <w:szCs w:val="20"/>
+              </w:rPr>
+              <w:t xml:space="preserve">Yes</w:t>
+            </w:r>
+          </w:p>
+        </w:tc>
+        <w:tc>
+          <w:tcPr>
+            <w:tcW w:type="dxa" w:w="1216"/>
             <w:tcBorders>
               <w:top w:val="single" w:color="D6D3D1" w:sz="4"/>
               <w:left w:val="single" w:color="D6D3D1" w:sz="4"/>
@@ -2261,59 +2360,59 @@
         </w:tc>
         <w:tc>
           <w:tcPr>
-            <w:tcW w:type="dxa" w:w="1337"/>
-            <w:tcBorders>
-              <w:top w:val="single" w:color="D6D3D1" w:sz="4"/>
-              <w:left w:val="single" w:color="D6D3D1" w:sz="4"/>
-              <w:bottom w:val="single" w:color="D6D3D1" w:sz="4"/>
-              <w:right w:val="single" w:color="D6D3D1" w:sz="4"/>
-            </w:tcBorders>
-            <w:tcMar>
-              <w:top w:type="dxa" w:w="60"/>
-              <w:left w:type="dxa" w:w="100"/>
-              <w:bottom w:type="dxa" w:w="60"/>
-              <w:right w:type="dxa" w:w="100"/>
-            </w:tcMar>
-          </w:tcPr>
-          <w:p>
-            <w:r>
-              <w:rPr>
-                <w:sz w:val="20"/>
-                <w:szCs w:val="20"/>
-              </w:rPr>
-              <w:t xml:space="preserve">Yes</w:t>
-            </w:r>
-          </w:p>
-        </w:tc>
-        <w:tc>
-          <w:tcPr>
-            <w:tcW w:type="dxa" w:w="1337"/>
-            <w:tcBorders>
-              <w:top w:val="single" w:color="D6D3D1" w:sz="4"/>
-              <w:left w:val="single" w:color="D6D3D1" w:sz="4"/>
-              <w:bottom w:val="single" w:color="D6D3D1" w:sz="4"/>
-              <w:right w:val="single" w:color="D6D3D1" w:sz="4"/>
-            </w:tcBorders>
-            <w:tcMar>
-              <w:top w:type="dxa" w:w="60"/>
-              <w:left w:type="dxa" w:w="100"/>
-              <w:bottom w:type="dxa" w:w="60"/>
-              <w:right w:type="dxa" w:w="100"/>
-            </w:tcMar>
-          </w:tcPr>
-          <w:p>
-            <w:r>
-              <w:rPr>
-                <w:sz w:val="20"/>
-                <w:szCs w:val="20"/>
-              </w:rPr>
-              <w:t xml:space="preserve">Yes</w:t>
-            </w:r>
-          </w:p>
-        </w:tc>
-        <w:tc>
-          <w:tcPr>
-            <w:tcW w:type="dxa" w:w="1337"/>
+            <w:tcW w:type="dxa" w:w="1216"/>
+            <w:tcBorders>
+              <w:top w:val="single" w:color="D6D3D1" w:sz="4"/>
+              <w:left w:val="single" w:color="D6D3D1" w:sz="4"/>
+              <w:bottom w:val="single" w:color="D6D3D1" w:sz="4"/>
+              <w:right w:val="single" w:color="D6D3D1" w:sz="4"/>
+            </w:tcBorders>
+            <w:tcMar>
+              <w:top w:type="dxa" w:w="60"/>
+              <w:left w:type="dxa" w:w="100"/>
+              <w:bottom w:type="dxa" w:w="60"/>
+              <w:right w:type="dxa" w:w="100"/>
+            </w:tcMar>
+          </w:tcPr>
+          <w:p>
+            <w:r>
+              <w:rPr>
+                <w:sz w:val="20"/>
+                <w:szCs w:val="20"/>
+              </w:rPr>
+              <w:t xml:space="preserve">Yes</w:t>
+            </w:r>
+          </w:p>
+        </w:tc>
+        <w:tc>
+          <w:tcPr>
+            <w:tcW w:type="dxa" w:w="1216"/>
+            <w:tcBorders>
+              <w:top w:val="single" w:color="D6D3D1" w:sz="4"/>
+              <w:left w:val="single" w:color="D6D3D1" w:sz="4"/>
+              <w:bottom w:val="single" w:color="D6D3D1" w:sz="4"/>
+              <w:right w:val="single" w:color="D6D3D1" w:sz="4"/>
+            </w:tcBorders>
+            <w:tcMar>
+              <w:top w:type="dxa" w:w="60"/>
+              <w:left w:type="dxa" w:w="100"/>
+              <w:bottom w:type="dxa" w:w="60"/>
+              <w:right w:type="dxa" w:w="100"/>
+            </w:tcMar>
+          </w:tcPr>
+          <w:p>
+            <w:r>
+              <w:rPr>
+                <w:sz w:val="20"/>
+                <w:szCs w:val="20"/>
+              </w:rPr>
+              <w:t xml:space="preserve">Yes</w:t>
+            </w:r>
+          </w:p>
+        </w:tc>
+        <w:tc>
+          <w:tcPr>
+            <w:tcW w:type="dxa" w:w="1216"/>
             <w:tcBorders>
               <w:top w:val="single" w:color="D6D3D1" w:sz="4"/>
               <w:left w:val="single" w:color="D6D3D1" w:sz="4"/>
@@ -2331,35 +2430,38 @@
         </w:tc>
         <w:tc>
           <w:tcPr>
-            <w:tcW w:type="dxa" w:w="1338"/>
-            <w:tcBorders>
-              <w:top w:val="single" w:color="D6D3D1" w:sz="4"/>
-              <w:left w:val="single" w:color="D6D3D1" w:sz="4"/>
-              <w:bottom w:val="single" w:color="D6D3D1" w:sz="4"/>
-              <w:right w:val="single" w:color="D6D3D1" w:sz="4"/>
-            </w:tcBorders>
-            <w:tcMar>
-              <w:top w:type="dxa" w:w="60"/>
-              <w:left w:type="dxa" w:w="100"/>
-              <w:bottom w:type="dxa" w:w="60"/>
-              <w:right w:type="dxa" w:w="100"/>
-            </w:tcMar>
-          </w:tcPr>
-          <w:p>
-            <w:r>
-              <w:rPr>
-                <w:sz w:val="20"/>
-                <w:szCs w:val="20"/>
-              </w:rPr>
-              <w:t xml:space="preserve">Yes*</w:t>
+            <w:tcW w:type="dxa" w:w="1221"/>
+            <w:tcBorders>
+              <w:top w:val="single" w:color="D6D3D1" w:sz="4"/>
+              <w:left w:val="single" w:color="D6D3D1" w:sz="4"/>
+              <w:bottom w:val="single" w:color="D6D3D1" w:sz="4"/>
+              <w:right w:val="single" w:color="D6D3D1" w:sz="4"/>
+            </w:tcBorders>
+            <w:tcMar>
+              <w:top w:type="dxa" w:w="60"/>
+              <w:left w:type="dxa" w:w="100"/>
+              <w:bottom w:type="dxa" w:w="60"/>
+              <w:right w:type="dxa" w:w="100"/>
+            </w:tcMar>
+          </w:tcPr>
+          <w:p>
+            <w:r>
+              <w:rPr>
+                <w:sz w:val="20"/>
+                <w:szCs w:val="20"/>
+              </w:rPr>
+              <w:t xml:space="preserve">Yes</w:t>
             </w:r>
           </w:p>
         </w:tc>
       </w:tr>
       <w:tr>
-        <w:tc>
-          <w:tcPr>
-            <w:tcW w:type="dxa" w:w="1337"/>
+        <w:trPr>
+          <w:cantSplit/>
+        </w:trPr>
+        <w:tc>
+          <w:tcPr>
+            <w:tcW w:type="dxa" w:w="2059"/>
             <w:tcBorders>
               <w:top w:val="single" w:color="D6D3D1" w:sz="4"/>
               <w:left w:val="single" w:color="D6D3D1" w:sz="4"/>
@@ -2385,7 +2487,7 @@
         </w:tc>
         <w:tc>
           <w:tcPr>
-            <w:tcW w:type="dxa" w:w="1337"/>
+            <w:tcW w:type="dxa" w:w="1216"/>
             <w:tcBorders>
               <w:top w:val="single" w:color="D6D3D1" w:sz="4"/>
               <w:left w:val="single" w:color="D6D3D1" w:sz="4"/>
@@ -2403,85 +2505,85 @@
         </w:tc>
         <w:tc>
           <w:tcPr>
-            <w:tcW w:type="dxa" w:w="1337"/>
-            <w:tcBorders>
-              <w:top w:val="single" w:color="D6D3D1" w:sz="4"/>
-              <w:left w:val="single" w:color="D6D3D1" w:sz="4"/>
-              <w:bottom w:val="single" w:color="D6D3D1" w:sz="4"/>
-              <w:right w:val="single" w:color="D6D3D1" w:sz="4"/>
-            </w:tcBorders>
-            <w:tcMar>
-              <w:top w:type="dxa" w:w="60"/>
-              <w:left w:type="dxa" w:w="100"/>
-              <w:bottom w:type="dxa" w:w="60"/>
-              <w:right w:type="dxa" w:w="100"/>
-            </w:tcMar>
-          </w:tcPr>
-          <w:p>
-            <w:r>
-              <w:rPr>
-                <w:sz w:val="20"/>
-                <w:szCs w:val="20"/>
-              </w:rPr>
-              <w:t xml:space="preserve">Yes</w:t>
-            </w:r>
-          </w:p>
-        </w:tc>
-        <w:tc>
-          <w:tcPr>
-            <w:tcW w:type="dxa" w:w="1337"/>
-            <w:tcBorders>
-              <w:top w:val="single" w:color="D6D3D1" w:sz="4"/>
-              <w:left w:val="single" w:color="D6D3D1" w:sz="4"/>
-              <w:bottom w:val="single" w:color="D6D3D1" w:sz="4"/>
-              <w:right w:val="single" w:color="D6D3D1" w:sz="4"/>
-            </w:tcBorders>
-            <w:tcMar>
-              <w:top w:type="dxa" w:w="60"/>
-              <w:left w:type="dxa" w:w="100"/>
-              <w:bottom w:type="dxa" w:w="60"/>
-              <w:right w:type="dxa" w:w="100"/>
-            </w:tcMar>
-          </w:tcPr>
-          <w:p>
-            <w:r>
-              <w:rPr>
-                <w:sz w:val="20"/>
-                <w:szCs w:val="20"/>
-              </w:rPr>
-              <w:t xml:space="preserve">Yes</w:t>
-            </w:r>
-          </w:p>
-        </w:tc>
-        <w:tc>
-          <w:tcPr>
-            <w:tcW w:type="dxa" w:w="1337"/>
-            <w:tcBorders>
-              <w:top w:val="single" w:color="D6D3D1" w:sz="4"/>
-              <w:left w:val="single" w:color="D6D3D1" w:sz="4"/>
-              <w:bottom w:val="single" w:color="D6D3D1" w:sz="4"/>
-              <w:right w:val="single" w:color="D6D3D1" w:sz="4"/>
-            </w:tcBorders>
-            <w:tcMar>
-              <w:top w:type="dxa" w:w="60"/>
-              <w:left w:type="dxa" w:w="100"/>
-              <w:bottom w:type="dxa" w:w="60"/>
-              <w:right w:type="dxa" w:w="100"/>
-            </w:tcMar>
-          </w:tcPr>
-          <w:p>
-            <w:r>
-              <w:rPr>
-                <w:sz w:val="20"/>
-                <w:szCs w:val="20"/>
-              </w:rPr>
-              <w:t xml:space="preserve">Yes</w:t>
-            </w:r>
-          </w:p>
-        </w:tc>
-        <w:tc>
-          <w:tcPr>
-            <w:tcW w:type="dxa" w:w="1337"/>
+            <w:tcW w:type="dxa" w:w="1216"/>
+            <w:tcBorders>
+              <w:top w:val="single" w:color="D6D3D1" w:sz="4"/>
+              <w:left w:val="single" w:color="D6D3D1" w:sz="4"/>
+              <w:bottom w:val="single" w:color="D6D3D1" w:sz="4"/>
+              <w:right w:val="single" w:color="D6D3D1" w:sz="4"/>
+            </w:tcBorders>
+            <w:tcMar>
+              <w:top w:type="dxa" w:w="60"/>
+              <w:left w:type="dxa" w:w="100"/>
+              <w:bottom w:type="dxa" w:w="60"/>
+              <w:right w:type="dxa" w:w="100"/>
+            </w:tcMar>
+          </w:tcPr>
+          <w:p>
+            <w:r>
+              <w:rPr>
+                <w:sz w:val="20"/>
+                <w:szCs w:val="20"/>
+              </w:rPr>
+              <w:t xml:space="preserve">Yes</w:t>
+            </w:r>
+          </w:p>
+        </w:tc>
+        <w:tc>
+          <w:tcPr>
+            <w:tcW w:type="dxa" w:w="1216"/>
+            <w:tcBorders>
+              <w:top w:val="single" w:color="D6D3D1" w:sz="4"/>
+              <w:left w:val="single" w:color="D6D3D1" w:sz="4"/>
+              <w:bottom w:val="single" w:color="D6D3D1" w:sz="4"/>
+              <w:right w:val="single" w:color="D6D3D1" w:sz="4"/>
+            </w:tcBorders>
+            <w:tcMar>
+              <w:top w:type="dxa" w:w="60"/>
+              <w:left w:type="dxa" w:w="100"/>
+              <w:bottom w:type="dxa" w:w="60"/>
+              <w:right w:type="dxa" w:w="100"/>
+            </w:tcMar>
+          </w:tcPr>
+          <w:p>
+            <w:r>
+              <w:rPr>
+                <w:sz w:val="20"/>
+                <w:szCs w:val="20"/>
+              </w:rPr>
+              <w:t xml:space="preserve">Yes</w:t>
+            </w:r>
+          </w:p>
+        </w:tc>
+        <w:tc>
+          <w:tcPr>
+            <w:tcW w:type="dxa" w:w="1216"/>
+            <w:tcBorders>
+              <w:top w:val="single" w:color="D6D3D1" w:sz="4"/>
+              <w:left w:val="single" w:color="D6D3D1" w:sz="4"/>
+              <w:bottom w:val="single" w:color="D6D3D1" w:sz="4"/>
+              <w:right w:val="single" w:color="D6D3D1" w:sz="4"/>
+            </w:tcBorders>
+            <w:tcMar>
+              <w:top w:type="dxa" w:w="60"/>
+              <w:left w:type="dxa" w:w="100"/>
+              <w:bottom w:type="dxa" w:w="60"/>
+              <w:right w:type="dxa" w:w="100"/>
+            </w:tcMar>
+          </w:tcPr>
+          <w:p>
+            <w:r>
+              <w:rPr>
+                <w:sz w:val="20"/>
+                <w:szCs w:val="20"/>
+              </w:rPr>
+              <w:t xml:space="preserve">Yes</w:t>
+            </w:r>
+          </w:p>
+        </w:tc>
+        <w:tc>
+          <w:tcPr>
+            <w:tcW w:type="dxa" w:w="1216"/>
             <w:tcBorders>
               <w:top w:val="single" w:color="D6D3D1" w:sz="4"/>
               <w:left w:val="single" w:color="D6D3D1" w:sz="4"/>
@@ -2499,7 +2601,7 @@
         </w:tc>
         <w:tc>
           <w:tcPr>
-            <w:tcW w:type="dxa" w:w="1338"/>
+            <w:tcW w:type="dxa" w:w="1221"/>
             <w:tcBorders>
               <w:top w:val="single" w:color="D6D3D1" w:sz="4"/>
               <w:left w:val="single" w:color="D6D3D1" w:sz="4"/>
@@ -2530,32 +2632,10 @@
         <w:spacing w:after="120"/>
       </w:pPr>
     </w:p>
-    <w:p>
-      <w:pPr>
-        <w:pStyle w:val="ListParagraph"/>
-        <w:numPr>
-          <w:ilvl w:val="0"/>
-          <w:numId w:val="2"/>
-        </w:numPr>
-      </w:pPr>
-      <w:r>
-        <w:t xml:space="preserve">Contractor access to technician tools is pending deploy (branch </w:t>
-      </w:r>
-      <w:r>
-        <w:rPr>
-          <w:rFonts w:ascii="Consolas" w:cs="Consolas" w:eastAsia="Consolas" w:hAnsi="Consolas"/>
-          <w:sz w:val="20"/>
-          <w:szCs w:val="20"/>
-        </w:rPr>
-        <w:t xml:space="preserve">contractor-tool-access</w:t>
-      </w:r>
-      <w:r>
-        <w:t xml:space="preserve">).</w:t>
-      </w:r>
-    </w:p>
     <w:sectPr>
+      <w:footerReference w:type="default" r:id="rId6"/>
       <w:pgSz w:w="12240" w:h="15840" w:orient="portrait"/>
-      <w:pgMar w:top="1440" w:right="1440" w:bottom="1440" w:left="1440" w:header="708" w:footer="708" w:gutter="0"/>
+      <w:pgMar w:top="1440" w:right="1440" w:bottom="1300" w:left="1440" w:header="708" w:footer="708" w:gutter="0"/>
       <w:pgNumType/>
       <w:docGrid w:linePitch="360"/>
     </w:sectPr>
@@ -2598,6 +2678,35 @@
     </w:p>
   </w:endnote>
 </w:endnotes>
+</file>
+
+<file path=word/footer1.xml><?xml version="1.0" encoding="utf-8"?>
+<w:ftr xmlns:wpc="http://schemas.microsoft.com/office/word/2010/wordprocessingCanvas" xmlns:mc="http://schemas.openxmlformats.org/markup-compatibility/2006" xmlns:o="urn:schemas-microsoft-com:office:office" xmlns:r="http://schemas.openxmlformats.org/officeDocument/2006/relationships" xmlns:m="http://schemas.openxmlformats.org/officeDocument/2006/math" xmlns:v="urn:schemas-microsoft-com:vml" xmlns:wp14="http://schemas.microsoft.com/office/word/2010/wordprocessingDrawing" xmlns:wp="http://schemas.openxmlformats.org/drawingml/2006/wordprocessingDrawing" xmlns:w10="urn:schemas-microsoft-com:office:word" xmlns:w="http://schemas.openxmlformats.org/wordprocessingml/2006/main" xmlns:w14="http://schemas.microsoft.com/office/word/2010/wordml" xmlns:w15="http://schemas.microsoft.com/office/word/2012/wordml" xmlns:wpg="http://schemas.microsoft.com/office/word/2010/wordprocessingGroup" xmlns:wpi="http://schemas.microsoft.com/office/word/2010/wordprocessingInk" xmlns:wne="http://schemas.microsoft.com/office/word/2006/wordml" xmlns:wps="http://schemas.microsoft.com/office/word/2010/wordprocessingShape">
+  <w:p>
+    <w:pPr>
+      <w:jc w:val="center"/>
+    </w:pPr>
+    <w:r>
+      <w:rPr>
+        <w:color w:val="78716C"/>
+        <w:sz w:val="16"/>
+        <w:szCs w:val="16"/>
+      </w:rPr>
+      <w:t xml:space="preserve">HEVACRAZ / NOU Zimbabwe HVAC Compliance Registry  |  Page </w:t>
+    </w:r>
+    <w:r>
+      <w:rPr>
+        <w:color w:val="78716C"/>
+        <w:sz w:val="16"/>
+        <w:szCs w:val="16"/>
+      </w:rPr>
+      <w:fldChar w:fldCharType="begin"/>
+      <w:instrText xml:space="preserve">PAGE</w:instrText>
+      <w:fldChar w:fldCharType="separate"/>
+      <w:fldChar w:fldCharType="end"/>
+    </w:r>
+  </w:p>
+</w:ftr>
 </file>
 
 <file path=word/footnotes.xml><?xml version="1.0" encoding="utf-8"?>
@@ -2952,6 +3061,7 @@
     <w:next w:val="Normal"/>
     <w:qFormat/>
     <w:pPr>
+      <w:keepNext/>
       <w:spacing w:after="120" w:before="280"/>
       <w:outlineLvl w:val="1"/>
     </w:pPr>
@@ -2970,6 +3080,7 @@
     <w:next w:val="Normal"/>
     <w:qFormat/>
     <w:pPr>
+      <w:keepNext/>
       <w:spacing w:after="80" w:before="200"/>
       <w:outlineLvl w:val="2"/>
     </w:pPr>

</xml_diff>